<commit_message>
docs(rapport): modernise rapport de stage LaTeX + captures d'ecran et soutenance
- rapport.tex/.md: annexes A-K, glossaire enrichi (33 entrées), page de garde
  et resume restyles, 4 figures de connexion (login, admin, OTP erreur/succes)
- ajout des 26 captures d'ecran (image/) : connexion, dashboard, espace alumni,
  Swagger, MCD/MLD
- nouvelle soutenance PreMSc 2026 (.pptx + generate_soutenance.py)
- generation PDF/DOCX des livrables via generate_reports/generate_methodologie
- front: emails d'exemple -> @ionis-stm.com (ExcelImport, AlumniProfile)
- README: compte endpoints 82
- suppression de l'ancien Rapport de Stage PDF (remplace par rapport.tex)
- gitignore: fichiers de sauvegarde LibreOffice (.lo1)
</commit_message>
<xml_diff>
--- a/Rapport/methodologie_indicateurs_insertion.docx
+++ b/Rapport/methodologie_indicateurs_insertion.docx
@@ -96,47 +96,99 @@
     </w:p>
     <w:tbl>
       <w:tblPr>
-        <w:tblStyle w:val="LightGrid-Accent1"/>
+        <w:tblStyle w:val="TableGrid"/>
         <w:tblW w:type="auto" w:w="0"/>
+        <w:jc w:val="center"/>
+        <w:tblLayout w:type="fixed"/>
         <w:tblLook w:firstColumn="1" w:firstRow="1" w:lastColumn="0" w:lastRow="0" w:noHBand="0" w:noVBand="1" w:val="04A0"/>
       </w:tblPr>
       <w:tblGrid>
-        <w:gridCol w:w="4320"/>
-        <w:gridCol w:w="4320"/>
+        <w:gridCol w:w="4706"/>
+        <w:gridCol w:w="4706"/>
       </w:tblGrid>
       <w:tr>
+        <w:trPr>
+          <w:tblHeader/>
+          <w:cantSplit/>
+        </w:trPr>
         <w:tc>
           <w:tcPr>
-            <w:tcW w:type="dxa" w:w="4320"/>
+            <w:tcW w:type="dxa" w:w="2268"/>
             <w:shd w:val="clear" w:color="auto" w:fill="DBEAFE"/>
+            <w:tcBorders>
+              <w:top w:val="single" w:sz="4" w:space="0" w:color="C4D2E2"/>
+              <w:left w:val="single" w:sz="4" w:space="0" w:color="C4D2E2"/>
+              <w:bottom w:val="single" w:sz="4" w:space="0" w:color="C4D2E2"/>
+              <w:right w:val="single" w:sz="4" w:space="0" w:color="C4D2E2"/>
+            </w:tcBorders>
           </w:tcPr>
           <w:p>
+            <w:pPr>
+              <w:spacing w:after="40" w:before="40"/>
+            </w:pPr>
+            <w:r/>
             <w:r>
+              <w:rPr>
+                <w:b/>
+                <w:color w:val="1E293B"/>
+                <w:sz w:val="20"/>
+              </w:rPr>
               <w:t>Champ</w:t>
             </w:r>
           </w:p>
         </w:tc>
         <w:tc>
           <w:tcPr>
-            <w:tcW w:type="dxa" w:w="4320"/>
+            <w:tcW w:type="dxa" w:w="6803"/>
             <w:shd w:val="clear" w:color="auto" w:fill="DBEAFE"/>
+            <w:tcBorders>
+              <w:top w:val="single" w:sz="4" w:space="0" w:color="C4D2E2"/>
+              <w:left w:val="single" w:sz="4" w:space="0" w:color="C4D2E2"/>
+              <w:bottom w:val="single" w:sz="4" w:space="0" w:color="C4D2E2"/>
+              <w:right w:val="single" w:sz="4" w:space="0" w:color="C4D2E2"/>
+            </w:tcBorders>
           </w:tcPr>
           <w:p>
+            <w:pPr>
+              <w:spacing w:after="40" w:before="40"/>
+            </w:pPr>
+            <w:r/>
             <w:r>
+              <w:rPr>
+                <w:b/>
+                <w:color w:val="1E293B"/>
+                <w:sz w:val="20"/>
+              </w:rPr>
               <w:t>Valeur</w:t>
             </w:r>
           </w:p>
         </w:tc>
       </w:tr>
       <w:tr>
+        <w:trPr>
+          <w:cantSplit/>
+        </w:trPr>
         <w:tc>
           <w:tcPr>
-            <w:tcW w:type="dxa" w:w="4320"/>
+            <w:tcW w:type="dxa" w:w="2268"/>
+            <w:shd w:val="clear" w:color="auto" w:fill="FFFFFF"/>
+            <w:tcBorders>
+              <w:top w:val="single" w:sz="4" w:space="0" w:color="C4D2E2"/>
+              <w:left w:val="single" w:sz="4" w:space="0" w:color="C4D2E2"/>
+              <w:bottom w:val="single" w:sz="4" w:space="0" w:color="C4D2E2"/>
+              <w:right w:val="single" w:sz="4" w:space="0" w:color="C4D2E2"/>
+            </w:tcBorders>
           </w:tcPr>
           <w:p>
+            <w:pPr>
+              <w:spacing w:after="40" w:before="40"/>
+            </w:pPr>
+            <w:r/>
             <w:r>
               <w:rPr>
                 <w:b/>
+                <w:color w:val="374151"/>
+                <w:sz w:val="20"/>
               </w:rPr>
               <w:t>Formule</w:t>
             </w:r>
@@ -144,24 +196,56 @@
         </w:tc>
         <w:tc>
           <w:tcPr>
-            <w:tcW w:type="dxa" w:w="4320"/>
+            <w:tcW w:type="dxa" w:w="6803"/>
+            <w:shd w:val="clear" w:color="auto" w:fill="FFFFFF"/>
+            <w:tcBorders>
+              <w:top w:val="single" w:sz="4" w:space="0" w:color="C4D2E2"/>
+              <w:left w:val="single" w:sz="4" w:space="0" w:color="C4D2E2"/>
+              <w:bottom w:val="single" w:sz="4" w:space="0" w:color="C4D2E2"/>
+              <w:right w:val="single" w:sz="4" w:space="0" w:color="C4D2E2"/>
+            </w:tcBorders>
           </w:tcPr>
           <w:p>
+            <w:pPr>
+              <w:spacing w:after="40" w:before="40"/>
+            </w:pPr>
+            <w:r/>
             <w:r>
+              <w:rPr>
+                <w:b w:val="0"/>
+                <w:color w:val="374151"/>
+                <w:sz w:val="20"/>
+              </w:rPr>
               <w:t>COUNT(*) FROM ETUDIANT WHERE date_anonymisation IS NULL</w:t>
             </w:r>
           </w:p>
         </w:tc>
       </w:tr>
       <w:tr>
+        <w:trPr>
+          <w:cantSplit/>
+        </w:trPr>
         <w:tc>
           <w:tcPr>
-            <w:tcW w:type="dxa" w:w="4320"/>
+            <w:tcW w:type="dxa" w:w="2268"/>
+            <w:shd w:val="clear" w:color="auto" w:fill="F4F7FC"/>
+            <w:tcBorders>
+              <w:top w:val="single" w:sz="4" w:space="0" w:color="C4D2E2"/>
+              <w:left w:val="single" w:sz="4" w:space="0" w:color="C4D2E2"/>
+              <w:bottom w:val="single" w:sz="4" w:space="0" w:color="C4D2E2"/>
+              <w:right w:val="single" w:sz="4" w:space="0" w:color="C4D2E2"/>
+            </w:tcBorders>
           </w:tcPr>
           <w:p>
+            <w:pPr>
+              <w:spacing w:after="40" w:before="40"/>
+            </w:pPr>
+            <w:r/>
             <w:r>
               <w:rPr>
                 <w:b/>
+                <w:color w:val="374151"/>
+                <w:sz w:val="20"/>
               </w:rPr>
               <w:t>Tables / colonnes</w:t>
             </w:r>
@@ -169,24 +253,56 @@
         </w:tc>
         <w:tc>
           <w:tcPr>
-            <w:tcW w:type="dxa" w:w="4320"/>
+            <w:tcW w:type="dxa" w:w="6803"/>
+            <w:shd w:val="clear" w:color="auto" w:fill="F4F7FC"/>
+            <w:tcBorders>
+              <w:top w:val="single" w:sz="4" w:space="0" w:color="C4D2E2"/>
+              <w:left w:val="single" w:sz="4" w:space="0" w:color="C4D2E2"/>
+              <w:bottom w:val="single" w:sz="4" w:space="0" w:color="C4D2E2"/>
+              <w:right w:val="single" w:sz="4" w:space="0" w:color="C4D2E2"/>
+            </w:tcBorders>
           </w:tcPr>
           <w:p>
+            <w:pPr>
+              <w:spacing w:after="40" w:before="40"/>
+            </w:pPr>
+            <w:r/>
             <w:r>
+              <w:rPr>
+                <w:b w:val="0"/>
+                <w:color w:val="374151"/>
+                <w:sz w:val="20"/>
+              </w:rPr>
               <w:t>ETUDIANT.date_anonymisation</w:t>
             </w:r>
           </w:p>
         </w:tc>
       </w:tr>
       <w:tr>
+        <w:trPr>
+          <w:cantSplit/>
+        </w:trPr>
         <w:tc>
           <w:tcPr>
-            <w:tcW w:type="dxa" w:w="4320"/>
+            <w:tcW w:type="dxa" w:w="2268"/>
+            <w:shd w:val="clear" w:color="auto" w:fill="FFFFFF"/>
+            <w:tcBorders>
+              <w:top w:val="single" w:sz="4" w:space="0" w:color="C4D2E2"/>
+              <w:left w:val="single" w:sz="4" w:space="0" w:color="C4D2E2"/>
+              <w:bottom w:val="single" w:sz="4" w:space="0" w:color="C4D2E2"/>
+              <w:right w:val="single" w:sz="4" w:space="0" w:color="C4D2E2"/>
+            </w:tcBorders>
           </w:tcPr>
           <w:p>
+            <w:pPr>
+              <w:spacing w:after="40" w:before="40"/>
+            </w:pPr>
+            <w:r/>
             <w:r>
               <w:rPr>
                 <w:b/>
+                <w:color w:val="374151"/>
+                <w:sz w:val="20"/>
               </w:rPr>
               <w:t>Exclusions / limites</w:t>
             </w:r>
@@ -194,24 +310,56 @@
         </w:tc>
         <w:tc>
           <w:tcPr>
-            <w:tcW w:type="dxa" w:w="4320"/>
+            <w:tcW w:type="dxa" w:w="6803"/>
+            <w:shd w:val="clear" w:color="auto" w:fill="FFFFFF"/>
+            <w:tcBorders>
+              <w:top w:val="single" w:sz="4" w:space="0" w:color="C4D2E2"/>
+              <w:left w:val="single" w:sz="4" w:space="0" w:color="C4D2E2"/>
+              <w:bottom w:val="single" w:sz="4" w:space="0" w:color="C4D2E2"/>
+              <w:right w:val="single" w:sz="4" w:space="0" w:color="C4D2E2"/>
+            </w:tcBorders>
           </w:tcPr>
           <w:p>
+            <w:pPr>
+              <w:spacing w:after="40" w:before="40"/>
+            </w:pPr>
+            <w:r/>
             <w:r>
+              <w:rPr>
+                <w:b w:val="0"/>
+                <w:color w:val="374151"/>
+                <w:sz w:val="20"/>
+              </w:rPr>
               <w:t>Comptes anonymises exclus.</w:t>
             </w:r>
           </w:p>
         </w:tc>
       </w:tr>
       <w:tr>
+        <w:trPr>
+          <w:cantSplit/>
+        </w:trPr>
         <w:tc>
           <w:tcPr>
-            <w:tcW w:type="dxa" w:w="4320"/>
+            <w:tcW w:type="dxa" w:w="2268"/>
+            <w:shd w:val="clear" w:color="auto" w:fill="F4F7FC"/>
+            <w:tcBorders>
+              <w:top w:val="single" w:sz="4" w:space="0" w:color="C4D2E2"/>
+              <w:left w:val="single" w:sz="4" w:space="0" w:color="C4D2E2"/>
+              <w:bottom w:val="single" w:sz="4" w:space="0" w:color="C4D2E2"/>
+              <w:right w:val="single" w:sz="4" w:space="0" w:color="C4D2E2"/>
+            </w:tcBorders>
           </w:tcPr>
           <w:p>
+            <w:pPr>
+              <w:spacing w:after="40" w:before="40"/>
+            </w:pPr>
+            <w:r/>
             <w:r>
               <w:rPr>
                 <w:b/>
+                <w:color w:val="374151"/>
+                <w:sz w:val="20"/>
               </w:rPr>
               <w:t>Exemple chiffre</w:t>
             </w:r>
@@ -219,10 +367,26 @@
         </w:tc>
         <w:tc>
           <w:tcPr>
-            <w:tcW w:type="dxa" w:w="4320"/>
+            <w:tcW w:type="dxa" w:w="6803"/>
+            <w:shd w:val="clear" w:color="auto" w:fill="F4F7FC"/>
+            <w:tcBorders>
+              <w:top w:val="single" w:sz="4" w:space="0" w:color="C4D2E2"/>
+              <w:left w:val="single" w:sz="4" w:space="0" w:color="C4D2E2"/>
+              <w:bottom w:val="single" w:sz="4" w:space="0" w:color="C4D2E2"/>
+              <w:right w:val="single" w:sz="4" w:space="0" w:color="C4D2E2"/>
+            </w:tcBorders>
           </w:tcPr>
           <w:p>
+            <w:pPr>
+              <w:spacing w:after="40" w:before="40"/>
+            </w:pPr>
+            <w:r/>
             <w:r>
+              <w:rPr>
+                <w:b w:val="0"/>
+                <w:color w:val="374151"/>
+                <w:sz w:val="20"/>
+              </w:rPr>
               <w:t>3 alumni (Rafik, Alice, Anonyme) -&gt; 2 (Anonyme exclu)</w:t>
             </w:r>
           </w:p>
@@ -241,47 +405,99 @@
     </w:p>
     <w:tbl>
       <w:tblPr>
-        <w:tblStyle w:val="LightGrid-Accent1"/>
+        <w:tblStyle w:val="TableGrid"/>
         <w:tblW w:type="auto" w:w="0"/>
+        <w:jc w:val="center"/>
+        <w:tblLayout w:type="fixed"/>
         <w:tblLook w:firstColumn="1" w:firstRow="1" w:lastColumn="0" w:lastRow="0" w:noHBand="0" w:noVBand="1" w:val="04A0"/>
       </w:tblPr>
       <w:tblGrid>
-        <w:gridCol w:w="4320"/>
-        <w:gridCol w:w="4320"/>
+        <w:gridCol w:w="4706"/>
+        <w:gridCol w:w="4706"/>
       </w:tblGrid>
       <w:tr>
+        <w:trPr>
+          <w:tblHeader/>
+          <w:cantSplit/>
+        </w:trPr>
         <w:tc>
           <w:tcPr>
-            <w:tcW w:type="dxa" w:w="4320"/>
+            <w:tcW w:type="dxa" w:w="2268"/>
             <w:shd w:val="clear" w:color="auto" w:fill="DBEAFE"/>
+            <w:tcBorders>
+              <w:top w:val="single" w:sz="4" w:space="0" w:color="C4D2E2"/>
+              <w:left w:val="single" w:sz="4" w:space="0" w:color="C4D2E2"/>
+              <w:bottom w:val="single" w:sz="4" w:space="0" w:color="C4D2E2"/>
+              <w:right w:val="single" w:sz="4" w:space="0" w:color="C4D2E2"/>
+            </w:tcBorders>
           </w:tcPr>
           <w:p>
+            <w:pPr>
+              <w:spacing w:after="40" w:before="40"/>
+            </w:pPr>
+            <w:r/>
             <w:r>
+              <w:rPr>
+                <w:b/>
+                <w:color w:val="1E293B"/>
+                <w:sz w:val="20"/>
+              </w:rPr>
               <w:t>Champ</w:t>
             </w:r>
           </w:p>
         </w:tc>
         <w:tc>
           <w:tcPr>
-            <w:tcW w:type="dxa" w:w="4320"/>
+            <w:tcW w:type="dxa" w:w="6803"/>
             <w:shd w:val="clear" w:color="auto" w:fill="DBEAFE"/>
+            <w:tcBorders>
+              <w:top w:val="single" w:sz="4" w:space="0" w:color="C4D2E2"/>
+              <w:left w:val="single" w:sz="4" w:space="0" w:color="C4D2E2"/>
+              <w:bottom w:val="single" w:sz="4" w:space="0" w:color="C4D2E2"/>
+              <w:right w:val="single" w:sz="4" w:space="0" w:color="C4D2E2"/>
+            </w:tcBorders>
           </w:tcPr>
           <w:p>
+            <w:pPr>
+              <w:spacing w:after="40" w:before="40"/>
+            </w:pPr>
+            <w:r/>
             <w:r>
+              <w:rPr>
+                <w:b/>
+                <w:color w:val="1E293B"/>
+                <w:sz w:val="20"/>
+              </w:rPr>
               <w:t>Valeur</w:t>
             </w:r>
           </w:p>
         </w:tc>
       </w:tr>
       <w:tr>
+        <w:trPr>
+          <w:cantSplit/>
+        </w:trPr>
         <w:tc>
           <w:tcPr>
-            <w:tcW w:type="dxa" w:w="4320"/>
+            <w:tcW w:type="dxa" w:w="2268"/>
+            <w:shd w:val="clear" w:color="auto" w:fill="FFFFFF"/>
+            <w:tcBorders>
+              <w:top w:val="single" w:sz="4" w:space="0" w:color="C4D2E2"/>
+              <w:left w:val="single" w:sz="4" w:space="0" w:color="C4D2E2"/>
+              <w:bottom w:val="single" w:sz="4" w:space="0" w:color="C4D2E2"/>
+              <w:right w:val="single" w:sz="4" w:space="0" w:color="C4D2E2"/>
+            </w:tcBorders>
           </w:tcPr>
           <w:p>
+            <w:pPr>
+              <w:spacing w:after="40" w:before="40"/>
+            </w:pPr>
+            <w:r/>
             <w:r>
               <w:rPr>
                 <w:b/>
+                <w:color w:val="374151"/>
+                <w:sz w:val="20"/>
               </w:rPr>
               <w:t>Formule</w:t>
             </w:r>
@@ -289,24 +505,56 @@
         </w:tc>
         <w:tc>
           <w:tcPr>
-            <w:tcW w:type="dxa" w:w="4320"/>
+            <w:tcW w:type="dxa" w:w="6803"/>
+            <w:shd w:val="clear" w:color="auto" w:fill="FFFFFF"/>
+            <w:tcBorders>
+              <w:top w:val="single" w:sz="4" w:space="0" w:color="C4D2E2"/>
+              <w:left w:val="single" w:sz="4" w:space="0" w:color="C4D2E2"/>
+              <w:bottom w:val="single" w:sz="4" w:space="0" w:color="C4D2E2"/>
+              <w:right w:val="single" w:sz="4" w:space="0" w:color="C4D2E2"/>
+            </w:tcBorders>
           </w:tcPr>
           <w:p>
+            <w:pPr>
+              <w:spacing w:after="40" w:before="40"/>
+            </w:pPr>
+            <w:r/>
             <w:r>
+              <w:rPr>
+                <w:b w:val="0"/>
+                <w:color w:val="374151"/>
+                <w:sz w:val="20"/>
+              </w:rPr>
               <w:t>COUNT(DISTINCT id_etudiant) FROM EXPERIENCE_PRO JOIN ETUDIANT non anonymises</w:t>
             </w:r>
           </w:p>
         </w:tc>
       </w:tr>
       <w:tr>
+        <w:trPr>
+          <w:cantSplit/>
+        </w:trPr>
         <w:tc>
           <w:tcPr>
-            <w:tcW w:type="dxa" w:w="4320"/>
+            <w:tcW w:type="dxa" w:w="2268"/>
+            <w:shd w:val="clear" w:color="auto" w:fill="F4F7FC"/>
+            <w:tcBorders>
+              <w:top w:val="single" w:sz="4" w:space="0" w:color="C4D2E2"/>
+              <w:left w:val="single" w:sz="4" w:space="0" w:color="C4D2E2"/>
+              <w:bottom w:val="single" w:sz="4" w:space="0" w:color="C4D2E2"/>
+              <w:right w:val="single" w:sz="4" w:space="0" w:color="C4D2E2"/>
+            </w:tcBorders>
           </w:tcPr>
           <w:p>
+            <w:pPr>
+              <w:spacing w:after="40" w:before="40"/>
+            </w:pPr>
+            <w:r/>
             <w:r>
               <w:rPr>
                 <w:b/>
+                <w:color w:val="374151"/>
+                <w:sz w:val="20"/>
               </w:rPr>
               <w:t>Tables / colonnes</w:t>
             </w:r>
@@ -314,24 +562,56 @@
         </w:tc>
         <w:tc>
           <w:tcPr>
-            <w:tcW w:type="dxa" w:w="4320"/>
+            <w:tcW w:type="dxa" w:w="6803"/>
+            <w:shd w:val="clear" w:color="auto" w:fill="F4F7FC"/>
+            <w:tcBorders>
+              <w:top w:val="single" w:sz="4" w:space="0" w:color="C4D2E2"/>
+              <w:left w:val="single" w:sz="4" w:space="0" w:color="C4D2E2"/>
+              <w:bottom w:val="single" w:sz="4" w:space="0" w:color="C4D2E2"/>
+              <w:right w:val="single" w:sz="4" w:space="0" w:color="C4D2E2"/>
+            </w:tcBorders>
           </w:tcPr>
           <w:p>
+            <w:pPr>
+              <w:spacing w:after="40" w:before="40"/>
+            </w:pPr>
+            <w:r/>
             <w:r>
+              <w:rPr>
+                <w:b w:val="0"/>
+                <w:color w:val="374151"/>
+                <w:sz w:val="20"/>
+              </w:rPr>
               <w:t>EXPERIENCE_PRO.id_etudiant, ETUDIANT.date_anonymisation</w:t>
             </w:r>
           </w:p>
         </w:tc>
       </w:tr>
       <w:tr>
+        <w:trPr>
+          <w:cantSplit/>
+        </w:trPr>
         <w:tc>
           <w:tcPr>
-            <w:tcW w:type="dxa" w:w="4320"/>
+            <w:tcW w:type="dxa" w:w="2268"/>
+            <w:shd w:val="clear" w:color="auto" w:fill="FFFFFF"/>
+            <w:tcBorders>
+              <w:top w:val="single" w:sz="4" w:space="0" w:color="C4D2E2"/>
+              <w:left w:val="single" w:sz="4" w:space="0" w:color="C4D2E2"/>
+              <w:bottom w:val="single" w:sz="4" w:space="0" w:color="C4D2E2"/>
+              <w:right w:val="single" w:sz="4" w:space="0" w:color="C4D2E2"/>
+            </w:tcBorders>
           </w:tcPr>
           <w:p>
+            <w:pPr>
+              <w:spacing w:after="40" w:before="40"/>
+            </w:pPr>
+            <w:r/>
             <w:r>
               <w:rPr>
                 <w:b/>
+                <w:color w:val="374151"/>
+                <w:sz w:val="20"/>
               </w:rPr>
               <w:t>Exclusions / limites</w:t>
             </w:r>
@@ -339,24 +619,56 @@
         </w:tc>
         <w:tc>
           <w:tcPr>
-            <w:tcW w:type="dxa" w:w="4320"/>
+            <w:tcW w:type="dxa" w:w="6803"/>
+            <w:shd w:val="clear" w:color="auto" w:fill="FFFFFF"/>
+            <w:tcBorders>
+              <w:top w:val="single" w:sz="4" w:space="0" w:color="C4D2E2"/>
+              <w:left w:val="single" w:sz="4" w:space="0" w:color="C4D2E2"/>
+              <w:bottom w:val="single" w:sz="4" w:space="0" w:color="C4D2E2"/>
+              <w:right w:val="single" w:sz="4" w:space="0" w:color="C4D2E2"/>
+            </w:tcBorders>
           </w:tcPr>
           <w:p>
+            <w:pPr>
+              <w:spacing w:after="40" w:before="40"/>
+            </w:pPr>
+            <w:r/>
             <w:r>
+              <w:rPr>
+                <w:b w:val="0"/>
+                <w:color w:val="374151"/>
+                <w:sz w:val="20"/>
+              </w:rPr>
               <w:t>Doublons exclus (DISTINCT). Aucune condition de date.</w:t>
             </w:r>
           </w:p>
         </w:tc>
       </w:tr>
       <w:tr>
+        <w:trPr>
+          <w:cantSplit/>
+        </w:trPr>
         <w:tc>
           <w:tcPr>
-            <w:tcW w:type="dxa" w:w="4320"/>
+            <w:tcW w:type="dxa" w:w="2268"/>
+            <w:shd w:val="clear" w:color="auto" w:fill="F4F7FC"/>
+            <w:tcBorders>
+              <w:top w:val="single" w:sz="4" w:space="0" w:color="C4D2E2"/>
+              <w:left w:val="single" w:sz="4" w:space="0" w:color="C4D2E2"/>
+              <w:bottom w:val="single" w:sz="4" w:space="0" w:color="C4D2E2"/>
+              <w:right w:val="single" w:sz="4" w:space="0" w:color="C4D2E2"/>
+            </w:tcBorders>
           </w:tcPr>
           <w:p>
+            <w:pPr>
+              <w:spacing w:after="40" w:before="40"/>
+            </w:pPr>
+            <w:r/>
             <w:r>
               <w:rPr>
                 <w:b/>
+                <w:color w:val="374151"/>
+                <w:sz w:val="20"/>
               </w:rPr>
               <w:t>Exemple chiffre</w:t>
             </w:r>
@@ -364,10 +676,26 @@
         </w:tc>
         <w:tc>
           <w:tcPr>
-            <w:tcW w:type="dxa" w:w="4320"/>
+            <w:tcW w:type="dxa" w:w="6803"/>
+            <w:shd w:val="clear" w:color="auto" w:fill="F4F7FC"/>
+            <w:tcBorders>
+              <w:top w:val="single" w:sz="4" w:space="0" w:color="C4D2E2"/>
+              <w:left w:val="single" w:sz="4" w:space="0" w:color="C4D2E2"/>
+              <w:bottom w:val="single" w:sz="4" w:space="0" w:color="C4D2E2"/>
+              <w:right w:val="single" w:sz="4" w:space="0" w:color="C4D2E2"/>
+            </w:tcBorders>
           </w:tcPr>
           <w:p>
+            <w:pPr>
+              <w:spacing w:after="40" w:before="40"/>
+            </w:pPr>
+            <w:r/>
             <w:r>
+              <w:rPr>
+                <w:b w:val="0"/>
+                <w:color w:val="374151"/>
+                <w:sz w:val="20"/>
+              </w:rPr>
               <w:t>Rafik (2 exp), Alice (1 exp), Anonyme exclu -&gt; 2</w:t>
             </w:r>
           </w:p>
@@ -386,47 +714,99 @@
     </w:p>
     <w:tbl>
       <w:tblPr>
-        <w:tblStyle w:val="LightGrid-Accent1"/>
+        <w:tblStyle w:val="TableGrid"/>
         <w:tblW w:type="auto" w:w="0"/>
+        <w:jc w:val="center"/>
+        <w:tblLayout w:type="fixed"/>
         <w:tblLook w:firstColumn="1" w:firstRow="1" w:lastColumn="0" w:lastRow="0" w:noHBand="0" w:noVBand="1" w:val="04A0"/>
       </w:tblPr>
       <w:tblGrid>
-        <w:gridCol w:w="4320"/>
-        <w:gridCol w:w="4320"/>
+        <w:gridCol w:w="4706"/>
+        <w:gridCol w:w="4706"/>
       </w:tblGrid>
       <w:tr>
+        <w:trPr>
+          <w:tblHeader/>
+          <w:cantSplit/>
+        </w:trPr>
         <w:tc>
           <w:tcPr>
-            <w:tcW w:type="dxa" w:w="4320"/>
+            <w:tcW w:type="dxa" w:w="2268"/>
             <w:shd w:val="clear" w:color="auto" w:fill="DBEAFE"/>
+            <w:tcBorders>
+              <w:top w:val="single" w:sz="4" w:space="0" w:color="C4D2E2"/>
+              <w:left w:val="single" w:sz="4" w:space="0" w:color="C4D2E2"/>
+              <w:bottom w:val="single" w:sz="4" w:space="0" w:color="C4D2E2"/>
+              <w:right w:val="single" w:sz="4" w:space="0" w:color="C4D2E2"/>
+            </w:tcBorders>
           </w:tcPr>
           <w:p>
+            <w:pPr>
+              <w:spacing w:after="40" w:before="40"/>
+            </w:pPr>
+            <w:r/>
             <w:r>
+              <w:rPr>
+                <w:b/>
+                <w:color w:val="1E293B"/>
+                <w:sz w:val="20"/>
+              </w:rPr>
               <w:t>Champ</w:t>
             </w:r>
           </w:p>
         </w:tc>
         <w:tc>
           <w:tcPr>
-            <w:tcW w:type="dxa" w:w="4320"/>
+            <w:tcW w:type="dxa" w:w="6803"/>
             <w:shd w:val="clear" w:color="auto" w:fill="DBEAFE"/>
+            <w:tcBorders>
+              <w:top w:val="single" w:sz="4" w:space="0" w:color="C4D2E2"/>
+              <w:left w:val="single" w:sz="4" w:space="0" w:color="C4D2E2"/>
+              <w:bottom w:val="single" w:sz="4" w:space="0" w:color="C4D2E2"/>
+              <w:right w:val="single" w:sz="4" w:space="0" w:color="C4D2E2"/>
+            </w:tcBorders>
           </w:tcPr>
           <w:p>
+            <w:pPr>
+              <w:spacing w:after="40" w:before="40"/>
+            </w:pPr>
+            <w:r/>
             <w:r>
+              <w:rPr>
+                <w:b/>
+                <w:color w:val="1E293B"/>
+                <w:sz w:val="20"/>
+              </w:rPr>
               <w:t>Valeur</w:t>
             </w:r>
           </w:p>
         </w:tc>
       </w:tr>
       <w:tr>
+        <w:trPr>
+          <w:cantSplit/>
+        </w:trPr>
         <w:tc>
           <w:tcPr>
-            <w:tcW w:type="dxa" w:w="4320"/>
+            <w:tcW w:type="dxa" w:w="2268"/>
+            <w:shd w:val="clear" w:color="auto" w:fill="FFFFFF"/>
+            <w:tcBorders>
+              <w:top w:val="single" w:sz="4" w:space="0" w:color="C4D2E2"/>
+              <w:left w:val="single" w:sz="4" w:space="0" w:color="C4D2E2"/>
+              <w:bottom w:val="single" w:sz="4" w:space="0" w:color="C4D2E2"/>
+              <w:right w:val="single" w:sz="4" w:space="0" w:color="C4D2E2"/>
+            </w:tcBorders>
           </w:tcPr>
           <w:p>
+            <w:pPr>
+              <w:spacing w:after="40" w:before="40"/>
+            </w:pPr>
+            <w:r/>
             <w:r>
               <w:rPr>
                 <w:b/>
+                <w:color w:val="374151"/>
+                <w:sz w:val="20"/>
               </w:rPr>
               <w:t>Formule</w:t>
             </w:r>
@@ -434,24 +814,56 @@
         </w:tc>
         <w:tc>
           <w:tcPr>
-            <w:tcW w:type="dxa" w:w="4320"/>
+            <w:tcW w:type="dxa" w:w="6803"/>
+            <w:shd w:val="clear" w:color="auto" w:fill="FFFFFF"/>
+            <w:tcBorders>
+              <w:top w:val="single" w:sz="4" w:space="0" w:color="C4D2E2"/>
+              <w:left w:val="single" w:sz="4" w:space="0" w:color="C4D2E2"/>
+              <w:bottom w:val="single" w:sz="4" w:space="0" w:color="C4D2E2"/>
+              <w:right w:val="single" w:sz="4" w:space="0" w:color="C4D2E2"/>
+            </w:tcBorders>
           </w:tcPr>
           <w:p>
+            <w:pPr>
+              <w:spacing w:after="40" w:before="40"/>
+            </w:pPr>
+            <w:r/>
             <w:r>
+              <w:rPr>
+                <w:b w:val="0"/>
+                <w:color w:val="374151"/>
+                <w:sz w:val="20"/>
+              </w:rPr>
               <w:t>(alumni avec &gt;= 1 experience / total alumni) x 100</w:t>
             </w:r>
           </w:p>
         </w:tc>
       </w:tr>
       <w:tr>
+        <w:trPr>
+          <w:cantSplit/>
+        </w:trPr>
         <w:tc>
           <w:tcPr>
-            <w:tcW w:type="dxa" w:w="4320"/>
+            <w:tcW w:type="dxa" w:w="2268"/>
+            <w:shd w:val="clear" w:color="auto" w:fill="F4F7FC"/>
+            <w:tcBorders>
+              <w:top w:val="single" w:sz="4" w:space="0" w:color="C4D2E2"/>
+              <w:left w:val="single" w:sz="4" w:space="0" w:color="C4D2E2"/>
+              <w:bottom w:val="single" w:sz="4" w:space="0" w:color="C4D2E2"/>
+              <w:right w:val="single" w:sz="4" w:space="0" w:color="C4D2E2"/>
+            </w:tcBorders>
           </w:tcPr>
           <w:p>
+            <w:pPr>
+              <w:spacing w:after="40" w:before="40"/>
+            </w:pPr>
+            <w:r/>
             <w:r>
               <w:rPr>
                 <w:b/>
+                <w:color w:val="374151"/>
+                <w:sz w:val="20"/>
               </w:rPr>
               <w:t>Tables / colonnes</w:t>
             </w:r>
@@ -459,24 +871,56 @@
         </w:tc>
         <w:tc>
           <w:tcPr>
-            <w:tcW w:type="dxa" w:w="4320"/>
+            <w:tcW w:type="dxa" w:w="6803"/>
+            <w:shd w:val="clear" w:color="auto" w:fill="F4F7FC"/>
+            <w:tcBorders>
+              <w:top w:val="single" w:sz="4" w:space="0" w:color="C4D2E2"/>
+              <w:left w:val="single" w:sz="4" w:space="0" w:color="C4D2E2"/>
+              <w:bottom w:val="single" w:sz="4" w:space="0" w:color="C4D2E2"/>
+              <w:right w:val="single" w:sz="4" w:space="0" w:color="C4D2E2"/>
+            </w:tcBorders>
           </w:tcPr>
           <w:p>
+            <w:pPr>
+              <w:spacing w:after="40" w:before="40"/>
+            </w:pPr>
+            <w:r/>
             <w:r>
+              <w:rPr>
+                <w:b w:val="0"/>
+                <w:color w:val="374151"/>
+                <w:sz w:val="20"/>
+              </w:rPr>
               <w:t>EXPERIENCE_PRO.id_etudiant, ETUDIANT.date_anonymisation</w:t>
             </w:r>
           </w:p>
         </w:tc>
       </w:tr>
       <w:tr>
+        <w:trPr>
+          <w:cantSplit/>
+        </w:trPr>
         <w:tc>
           <w:tcPr>
-            <w:tcW w:type="dxa" w:w="4320"/>
+            <w:tcW w:type="dxa" w:w="2268"/>
+            <w:shd w:val="clear" w:color="auto" w:fill="FFFFFF"/>
+            <w:tcBorders>
+              <w:top w:val="single" w:sz="4" w:space="0" w:color="C4D2E2"/>
+              <w:left w:val="single" w:sz="4" w:space="0" w:color="C4D2E2"/>
+              <w:bottom w:val="single" w:sz="4" w:space="0" w:color="C4D2E2"/>
+              <w:right w:val="single" w:sz="4" w:space="0" w:color="C4D2E2"/>
+            </w:tcBorders>
           </w:tcPr>
           <w:p>
+            <w:pPr>
+              <w:spacing w:after="40" w:before="40"/>
+            </w:pPr>
+            <w:r/>
             <w:r>
               <w:rPr>
                 <w:b/>
+                <w:color w:val="374151"/>
+                <w:sz w:val="20"/>
               </w:rPr>
               <w:t>Exclusions / limites</w:t>
             </w:r>
@@ -484,24 +928,56 @@
         </w:tc>
         <w:tc>
           <w:tcPr>
-            <w:tcW w:type="dxa" w:w="4320"/>
+            <w:tcW w:type="dxa" w:w="6803"/>
+            <w:shd w:val="clear" w:color="auto" w:fill="FFFFFF"/>
+            <w:tcBorders>
+              <w:top w:val="single" w:sz="4" w:space="0" w:color="C4D2E2"/>
+              <w:left w:val="single" w:sz="4" w:space="0" w:color="C4D2E2"/>
+              <w:bottom w:val="single" w:sz="4" w:space="0" w:color="C4D2E2"/>
+              <w:right w:val="single" w:sz="4" w:space="0" w:color="C4D2E2"/>
+            </w:tcBorders>
           </w:tcPr>
           <w:p>
+            <w:pPr>
+              <w:spacing w:after="40" w:before="40"/>
+            </w:pPr>
+            <w:r/>
             <w:r>
+              <w:rPr>
+                <w:b w:val="0"/>
+                <w:color w:val="374151"/>
+                <w:sz w:val="20"/>
+              </w:rPr>
               <w:t>Profil sans experience = incomplet.</w:t>
             </w:r>
           </w:p>
         </w:tc>
       </w:tr>
       <w:tr>
+        <w:trPr>
+          <w:cantSplit/>
+        </w:trPr>
         <w:tc>
           <w:tcPr>
-            <w:tcW w:type="dxa" w:w="4320"/>
+            <w:tcW w:type="dxa" w:w="2268"/>
+            <w:shd w:val="clear" w:color="auto" w:fill="F4F7FC"/>
+            <w:tcBorders>
+              <w:top w:val="single" w:sz="4" w:space="0" w:color="C4D2E2"/>
+              <w:left w:val="single" w:sz="4" w:space="0" w:color="C4D2E2"/>
+              <w:bottom w:val="single" w:sz="4" w:space="0" w:color="C4D2E2"/>
+              <w:right w:val="single" w:sz="4" w:space="0" w:color="C4D2E2"/>
+            </w:tcBorders>
           </w:tcPr>
           <w:p>
+            <w:pPr>
+              <w:spacing w:after="40" w:before="40"/>
+            </w:pPr>
+            <w:r/>
             <w:r>
               <w:rPr>
                 <w:b/>
+                <w:color w:val="374151"/>
+                <w:sz w:val="20"/>
               </w:rPr>
               <w:t>Exemple chiffre</w:t>
             </w:r>
@@ -509,10 +985,26 @@
         </w:tc>
         <w:tc>
           <w:tcPr>
-            <w:tcW w:type="dxa" w:w="4320"/>
+            <w:tcW w:type="dxa" w:w="6803"/>
+            <w:shd w:val="clear" w:color="auto" w:fill="F4F7FC"/>
+            <w:tcBorders>
+              <w:top w:val="single" w:sz="4" w:space="0" w:color="C4D2E2"/>
+              <w:left w:val="single" w:sz="4" w:space="0" w:color="C4D2E2"/>
+              <w:bottom w:val="single" w:sz="4" w:space="0" w:color="C4D2E2"/>
+              <w:right w:val="single" w:sz="4" w:space="0" w:color="C4D2E2"/>
+            </w:tcBorders>
           </w:tcPr>
           <w:p>
+            <w:pPr>
+              <w:spacing w:after="40" w:before="40"/>
+            </w:pPr>
+            <w:r/>
             <w:r>
+              <w:rPr>
+                <w:b w:val="0"/>
+                <w:color w:val="374151"/>
+                <w:sz w:val="20"/>
+              </w:rPr>
               <w:t>2 non anonymises, 1 avec exp -&gt; (1/2)x100 = 50 %</w:t>
             </w:r>
           </w:p>
@@ -531,47 +1023,99 @@
     </w:p>
     <w:tbl>
       <w:tblPr>
-        <w:tblStyle w:val="LightGrid-Accent1"/>
+        <w:tblStyle w:val="TableGrid"/>
         <w:tblW w:type="auto" w:w="0"/>
+        <w:jc w:val="center"/>
+        <w:tblLayout w:type="fixed"/>
         <w:tblLook w:firstColumn="1" w:firstRow="1" w:lastColumn="0" w:lastRow="0" w:noHBand="0" w:noVBand="1" w:val="04A0"/>
       </w:tblPr>
       <w:tblGrid>
-        <w:gridCol w:w="4320"/>
-        <w:gridCol w:w="4320"/>
+        <w:gridCol w:w="4706"/>
+        <w:gridCol w:w="4706"/>
       </w:tblGrid>
       <w:tr>
+        <w:trPr>
+          <w:tblHeader/>
+          <w:cantSplit/>
+        </w:trPr>
         <w:tc>
           <w:tcPr>
-            <w:tcW w:type="dxa" w:w="4320"/>
+            <w:tcW w:type="dxa" w:w="2268"/>
             <w:shd w:val="clear" w:color="auto" w:fill="DBEAFE"/>
+            <w:tcBorders>
+              <w:top w:val="single" w:sz="4" w:space="0" w:color="C4D2E2"/>
+              <w:left w:val="single" w:sz="4" w:space="0" w:color="C4D2E2"/>
+              <w:bottom w:val="single" w:sz="4" w:space="0" w:color="C4D2E2"/>
+              <w:right w:val="single" w:sz="4" w:space="0" w:color="C4D2E2"/>
+            </w:tcBorders>
           </w:tcPr>
           <w:p>
+            <w:pPr>
+              <w:spacing w:after="40" w:before="40"/>
+            </w:pPr>
+            <w:r/>
             <w:r>
+              <w:rPr>
+                <w:b/>
+                <w:color w:val="1E293B"/>
+                <w:sz w:val="20"/>
+              </w:rPr>
               <w:t>Champ</w:t>
             </w:r>
           </w:p>
         </w:tc>
         <w:tc>
           <w:tcPr>
-            <w:tcW w:type="dxa" w:w="4320"/>
+            <w:tcW w:type="dxa" w:w="6803"/>
             <w:shd w:val="clear" w:color="auto" w:fill="DBEAFE"/>
+            <w:tcBorders>
+              <w:top w:val="single" w:sz="4" w:space="0" w:color="C4D2E2"/>
+              <w:left w:val="single" w:sz="4" w:space="0" w:color="C4D2E2"/>
+              <w:bottom w:val="single" w:sz="4" w:space="0" w:color="C4D2E2"/>
+              <w:right w:val="single" w:sz="4" w:space="0" w:color="C4D2E2"/>
+            </w:tcBorders>
           </w:tcPr>
           <w:p>
+            <w:pPr>
+              <w:spacing w:after="40" w:before="40"/>
+            </w:pPr>
+            <w:r/>
             <w:r>
+              <w:rPr>
+                <w:b/>
+                <w:color w:val="1E293B"/>
+                <w:sz w:val="20"/>
+              </w:rPr>
               <w:t>Valeur</w:t>
             </w:r>
           </w:p>
         </w:tc>
       </w:tr>
       <w:tr>
+        <w:trPr>
+          <w:cantSplit/>
+        </w:trPr>
         <w:tc>
           <w:tcPr>
-            <w:tcW w:type="dxa" w:w="4320"/>
+            <w:tcW w:type="dxa" w:w="2268"/>
+            <w:shd w:val="clear" w:color="auto" w:fill="FFFFFF"/>
+            <w:tcBorders>
+              <w:top w:val="single" w:sz="4" w:space="0" w:color="C4D2E2"/>
+              <w:left w:val="single" w:sz="4" w:space="0" w:color="C4D2E2"/>
+              <w:bottom w:val="single" w:sz="4" w:space="0" w:color="C4D2E2"/>
+              <w:right w:val="single" w:sz="4" w:space="0" w:color="C4D2E2"/>
+            </w:tcBorders>
           </w:tcPr>
           <w:p>
+            <w:pPr>
+              <w:spacing w:after="40" w:before="40"/>
+            </w:pPr>
+            <w:r/>
             <w:r>
               <w:rPr>
                 <w:b/>
+                <w:color w:val="374151"/>
+                <w:sz w:val="20"/>
               </w:rPr>
               <w:t>Formule</w:t>
             </w:r>
@@ -579,24 +1123,56 @@
         </w:tc>
         <w:tc>
           <w:tcPr>
-            <w:tcW w:type="dxa" w:w="4320"/>
+            <w:tcW w:type="dxa" w:w="6803"/>
+            <w:shd w:val="clear" w:color="auto" w:fill="FFFFFF"/>
+            <w:tcBorders>
+              <w:top w:val="single" w:sz="4" w:space="0" w:color="C4D2E2"/>
+              <w:left w:val="single" w:sz="4" w:space="0" w:color="C4D2E2"/>
+              <w:bottom w:val="single" w:sz="4" w:space="0" w:color="C4D2E2"/>
+              <w:right w:val="single" w:sz="4" w:space="0" w:color="C4D2E2"/>
+            </w:tcBorders>
           </w:tcPr>
           <w:p>
+            <w:pPr>
+              <w:spacing w:after="40" w:before="40"/>
+            </w:pPr>
+            <w:r/>
             <w:r>
+              <w:rPr>
+                <w:b w:val="0"/>
+                <w:color w:val="374151"/>
+                <w:sz w:val="20"/>
+              </w:rPr>
               <w:t>date_reference = annee_diplome || '-12-01' (diplomation juin + 6 mois). Exp. active si date_debut &lt;= reference AND (date_fin IS NULL OR date_fin &gt;= reference). Taux = SUM(emplois_6_mois)/SUM(total_diplomes) x 100 (promotions matures).</w:t>
             </w:r>
           </w:p>
         </w:tc>
       </w:tr>
       <w:tr>
+        <w:trPr>
+          <w:cantSplit/>
+        </w:trPr>
         <w:tc>
           <w:tcPr>
-            <w:tcW w:type="dxa" w:w="4320"/>
+            <w:tcW w:type="dxa" w:w="2268"/>
+            <w:shd w:val="clear" w:color="auto" w:fill="F4F7FC"/>
+            <w:tcBorders>
+              <w:top w:val="single" w:sz="4" w:space="0" w:color="C4D2E2"/>
+              <w:left w:val="single" w:sz="4" w:space="0" w:color="C4D2E2"/>
+              <w:bottom w:val="single" w:sz="4" w:space="0" w:color="C4D2E2"/>
+              <w:right w:val="single" w:sz="4" w:space="0" w:color="C4D2E2"/>
+            </w:tcBorders>
           </w:tcPr>
           <w:p>
+            <w:pPr>
+              <w:spacing w:after="40" w:before="40"/>
+            </w:pPr>
+            <w:r/>
             <w:r>
               <w:rPr>
                 <w:b/>
+                <w:color w:val="374151"/>
+                <w:sz w:val="20"/>
               </w:rPr>
               <w:t>Tables / colonnes</w:t>
             </w:r>
@@ -604,24 +1180,56 @@
         </w:tc>
         <w:tc>
           <w:tcPr>
-            <w:tcW w:type="dxa" w:w="4320"/>
+            <w:tcW w:type="dxa" w:w="6803"/>
+            <w:shd w:val="clear" w:color="auto" w:fill="F4F7FC"/>
+            <w:tcBorders>
+              <w:top w:val="single" w:sz="4" w:space="0" w:color="C4D2E2"/>
+              <w:left w:val="single" w:sz="4" w:space="0" w:color="C4D2E2"/>
+              <w:bottom w:val="single" w:sz="4" w:space="0" w:color="C4D2E2"/>
+              <w:right w:val="single" w:sz="4" w:space="0" w:color="C4D2E2"/>
+            </w:tcBorders>
           </w:tcPr>
           <w:p>
+            <w:pPr>
+              <w:spacing w:after="40" w:before="40"/>
+            </w:pPr>
+            <w:r/>
             <w:r>
+              <w:rPr>
+                <w:b w:val="0"/>
+                <w:color w:val="374151"/>
+                <w:sz w:val="20"/>
+              </w:rPr>
               <w:t>PROMOTION.annee_diplome, ETUDIANT.id_promotion, EXPERIENCE_PRO.date_debut/fin</w:t>
             </w:r>
           </w:p>
         </w:tc>
       </w:tr>
       <w:tr>
+        <w:trPr>
+          <w:cantSplit/>
+        </w:trPr>
         <w:tc>
           <w:tcPr>
-            <w:tcW w:type="dxa" w:w="4320"/>
+            <w:tcW w:type="dxa" w:w="2268"/>
+            <w:shd w:val="clear" w:color="auto" w:fill="FFFFFF"/>
+            <w:tcBorders>
+              <w:top w:val="single" w:sz="4" w:space="0" w:color="C4D2E2"/>
+              <w:left w:val="single" w:sz="4" w:space="0" w:color="C4D2E2"/>
+              <w:bottom w:val="single" w:sz="4" w:space="0" w:color="C4D2E2"/>
+              <w:right w:val="single" w:sz="4" w:space="0" w:color="C4D2E2"/>
+            </w:tcBorders>
           </w:tcPr>
           <w:p>
+            <w:pPr>
+              <w:spacing w:after="40" w:before="40"/>
+            </w:pPr>
+            <w:r/>
             <w:r>
               <w:rPr>
                 <w:b/>
+                <w:color w:val="374151"/>
+                <w:sz w:val="20"/>
               </w:rPr>
               <w:t>Exclusions / limites</w:t>
             </w:r>
@@ -629,24 +1237,56 @@
         </w:tc>
         <w:tc>
           <w:tcPr>
-            <w:tcW w:type="dxa" w:w="4320"/>
+            <w:tcW w:type="dxa" w:w="6803"/>
+            <w:shd w:val="clear" w:color="auto" w:fill="FFFFFF"/>
+            <w:tcBorders>
+              <w:top w:val="single" w:sz="4" w:space="0" w:color="C4D2E2"/>
+              <w:left w:val="single" w:sz="4" w:space="0" w:color="C4D2E2"/>
+              <w:bottom w:val="single" w:sz="4" w:space="0" w:color="C4D2E2"/>
+              <w:right w:val="single" w:sz="4" w:space="0" w:color="C4D2E2"/>
+            </w:tcBorders>
           </w:tcPr>
           <w:p>
+            <w:pPr>
+              <w:spacing w:after="40" w:before="40"/>
+            </w:pPr>
+            <w:r/>
             <w:r>
+              <w:rPr>
+                <w:b w:val="0"/>
+                <w:color w:val="374151"/>
+                <w:sz w:val="20"/>
+              </w:rPr>
               <w:t>Promotions non matures exclues du global -&gt; statut en_attente, taux null.</w:t>
             </w:r>
           </w:p>
         </w:tc>
       </w:tr>
       <w:tr>
+        <w:trPr>
+          <w:cantSplit/>
+        </w:trPr>
         <w:tc>
           <w:tcPr>
-            <w:tcW w:type="dxa" w:w="4320"/>
+            <w:tcW w:type="dxa" w:w="2268"/>
+            <w:shd w:val="clear" w:color="auto" w:fill="F4F7FC"/>
+            <w:tcBorders>
+              <w:top w:val="single" w:sz="4" w:space="0" w:color="C4D2E2"/>
+              <w:left w:val="single" w:sz="4" w:space="0" w:color="C4D2E2"/>
+              <w:bottom w:val="single" w:sz="4" w:space="0" w:color="C4D2E2"/>
+              <w:right w:val="single" w:sz="4" w:space="0" w:color="C4D2E2"/>
+            </w:tcBorders>
           </w:tcPr>
           <w:p>
+            <w:pPr>
+              <w:spacing w:after="40" w:before="40"/>
+            </w:pPr>
+            <w:r/>
             <w:r>
               <w:rPr>
                 <w:b/>
+                <w:color w:val="374151"/>
+                <w:sz w:val="20"/>
               </w:rPr>
               <w:t>Exemple chiffre</w:t>
             </w:r>
@@ -654,10 +1294,26 @@
         </w:tc>
         <w:tc>
           <w:tcPr>
-            <w:tcW w:type="dxa" w:w="4320"/>
+            <w:tcW w:type="dxa" w:w="6803"/>
+            <w:shd w:val="clear" w:color="auto" w:fill="F4F7FC"/>
+            <w:tcBorders>
+              <w:top w:val="single" w:sz="4" w:space="0" w:color="C4D2E2"/>
+              <w:left w:val="single" w:sz="4" w:space="0" w:color="C4D2E2"/>
+              <w:bottom w:val="single" w:sz="4" w:space="0" w:color="C4D2E2"/>
+              <w:right w:val="single" w:sz="4" w:space="0" w:color="C4D2E2"/>
+            </w:tcBorders>
           </w:tcPr>
           <w:p>
+            <w:pPr>
+              <w:spacing w:after="40" w:before="40"/>
+            </w:pPr>
+            <w:r/>
             <w:r>
+              <w:rPr>
+                <w:b w:val="0"/>
+                <w:color w:val="374151"/>
+                <w:sz w:val="20"/>
+              </w:rPr>
               <w:t>2024 : 7/10 ; 2025 : 9/12 ; 2026 en_attente -&gt; (16/22) = 72,7 %</w:t>
             </w:r>
           </w:p>
@@ -676,47 +1332,99 @@
     </w:p>
     <w:tbl>
       <w:tblPr>
-        <w:tblStyle w:val="LightGrid-Accent1"/>
+        <w:tblStyle w:val="TableGrid"/>
         <w:tblW w:type="auto" w:w="0"/>
+        <w:jc w:val="center"/>
+        <w:tblLayout w:type="fixed"/>
         <w:tblLook w:firstColumn="1" w:firstRow="1" w:lastColumn="0" w:lastRow="0" w:noHBand="0" w:noVBand="1" w:val="04A0"/>
       </w:tblPr>
       <w:tblGrid>
-        <w:gridCol w:w="4320"/>
-        <w:gridCol w:w="4320"/>
+        <w:gridCol w:w="4706"/>
+        <w:gridCol w:w="4706"/>
       </w:tblGrid>
       <w:tr>
+        <w:trPr>
+          <w:tblHeader/>
+          <w:cantSplit/>
+        </w:trPr>
         <w:tc>
           <w:tcPr>
-            <w:tcW w:type="dxa" w:w="4320"/>
+            <w:tcW w:type="dxa" w:w="2268"/>
             <w:shd w:val="clear" w:color="auto" w:fill="DBEAFE"/>
+            <w:tcBorders>
+              <w:top w:val="single" w:sz="4" w:space="0" w:color="C4D2E2"/>
+              <w:left w:val="single" w:sz="4" w:space="0" w:color="C4D2E2"/>
+              <w:bottom w:val="single" w:sz="4" w:space="0" w:color="C4D2E2"/>
+              <w:right w:val="single" w:sz="4" w:space="0" w:color="C4D2E2"/>
+            </w:tcBorders>
           </w:tcPr>
           <w:p>
+            <w:pPr>
+              <w:spacing w:after="40" w:before="40"/>
+            </w:pPr>
+            <w:r/>
             <w:r>
+              <w:rPr>
+                <w:b/>
+                <w:color w:val="1E293B"/>
+                <w:sz w:val="20"/>
+              </w:rPr>
               <w:t>Champ</w:t>
             </w:r>
           </w:p>
         </w:tc>
         <w:tc>
           <w:tcPr>
-            <w:tcW w:type="dxa" w:w="4320"/>
+            <w:tcW w:type="dxa" w:w="6803"/>
             <w:shd w:val="clear" w:color="auto" w:fill="DBEAFE"/>
+            <w:tcBorders>
+              <w:top w:val="single" w:sz="4" w:space="0" w:color="C4D2E2"/>
+              <w:left w:val="single" w:sz="4" w:space="0" w:color="C4D2E2"/>
+              <w:bottom w:val="single" w:sz="4" w:space="0" w:color="C4D2E2"/>
+              <w:right w:val="single" w:sz="4" w:space="0" w:color="C4D2E2"/>
+            </w:tcBorders>
           </w:tcPr>
           <w:p>
+            <w:pPr>
+              <w:spacing w:after="40" w:before="40"/>
+            </w:pPr>
+            <w:r/>
             <w:r>
+              <w:rPr>
+                <w:b/>
+                <w:color w:val="1E293B"/>
+                <w:sz w:val="20"/>
+              </w:rPr>
               <w:t>Valeur</w:t>
             </w:r>
           </w:p>
         </w:tc>
       </w:tr>
       <w:tr>
+        <w:trPr>
+          <w:cantSplit/>
+        </w:trPr>
         <w:tc>
           <w:tcPr>
-            <w:tcW w:type="dxa" w:w="4320"/>
+            <w:tcW w:type="dxa" w:w="2268"/>
+            <w:shd w:val="clear" w:color="auto" w:fill="FFFFFF"/>
+            <w:tcBorders>
+              <w:top w:val="single" w:sz="4" w:space="0" w:color="C4D2E2"/>
+              <w:left w:val="single" w:sz="4" w:space="0" w:color="C4D2E2"/>
+              <w:bottom w:val="single" w:sz="4" w:space="0" w:color="C4D2E2"/>
+              <w:right w:val="single" w:sz="4" w:space="0" w:color="C4D2E2"/>
+            </w:tcBorders>
           </w:tcPr>
           <w:p>
+            <w:pPr>
+              <w:spacing w:after="40" w:before="40"/>
+            </w:pPr>
+            <w:r/>
             <w:r>
               <w:rPr>
                 <w:b/>
+                <w:color w:val="374151"/>
+                <w:sz w:val="20"/>
               </w:rPr>
               <w:t>Formule</w:t>
             </w:r>
@@ -724,24 +1432,56 @@
         </w:tc>
         <w:tc>
           <w:tcPr>
-            <w:tcW w:type="dxa" w:w="4320"/>
+            <w:tcW w:type="dxa" w:w="6803"/>
+            <w:shd w:val="clear" w:color="auto" w:fill="FFFFFF"/>
+            <w:tcBorders>
+              <w:top w:val="single" w:sz="4" w:space="0" w:color="C4D2E2"/>
+              <w:left w:val="single" w:sz="4" w:space="0" w:color="C4D2E2"/>
+              <w:bottom w:val="single" w:sz="4" w:space="0" w:color="C4D2E2"/>
+              <w:right w:val="single" w:sz="4" w:space="0" w:color="C4D2E2"/>
+            </w:tcBorders>
           </w:tcPr>
           <w:p>
+            <w:pPr>
+              <w:spacing w:after="40" w:before="40"/>
+            </w:pPr>
+            <w:r/>
             <w:r>
+              <w:rPr>
+                <w:b w:val="0"/>
+                <w:color w:val="374151"/>
+                <w:sz w:val="20"/>
+              </w:rPr>
               <w:t>(etudiants en poste / total etudiants) x 100, par promotion puis somme</w:t>
             </w:r>
           </w:p>
         </w:tc>
       </w:tr>
       <w:tr>
+        <w:trPr>
+          <w:cantSplit/>
+        </w:trPr>
         <w:tc>
           <w:tcPr>
-            <w:tcW w:type="dxa" w:w="4320"/>
+            <w:tcW w:type="dxa" w:w="2268"/>
+            <w:shd w:val="clear" w:color="auto" w:fill="F4F7FC"/>
+            <w:tcBorders>
+              <w:top w:val="single" w:sz="4" w:space="0" w:color="C4D2E2"/>
+              <w:left w:val="single" w:sz="4" w:space="0" w:color="C4D2E2"/>
+              <w:bottom w:val="single" w:sz="4" w:space="0" w:color="C4D2E2"/>
+              <w:right w:val="single" w:sz="4" w:space="0" w:color="C4D2E2"/>
+            </w:tcBorders>
           </w:tcPr>
           <w:p>
+            <w:pPr>
+              <w:spacing w:after="40" w:before="40"/>
+            </w:pPr>
+            <w:r/>
             <w:r>
               <w:rPr>
                 <w:b/>
+                <w:color w:val="374151"/>
+                <w:sz w:val="20"/>
               </w:rPr>
               <w:t>Tables / colonnes</w:t>
             </w:r>
@@ -749,24 +1489,56 @@
         </w:tc>
         <w:tc>
           <w:tcPr>
-            <w:tcW w:type="dxa" w:w="4320"/>
+            <w:tcW w:type="dxa" w:w="6803"/>
+            <w:shd w:val="clear" w:color="auto" w:fill="F4F7FC"/>
+            <w:tcBorders>
+              <w:top w:val="single" w:sz="4" w:space="0" w:color="C4D2E2"/>
+              <w:left w:val="single" w:sz="4" w:space="0" w:color="C4D2E2"/>
+              <w:bottom w:val="single" w:sz="4" w:space="0" w:color="C4D2E2"/>
+              <w:right w:val="single" w:sz="4" w:space="0" w:color="C4D2E2"/>
+            </w:tcBorders>
           </w:tcPr>
           <w:p>
+            <w:pPr>
+              <w:spacing w:after="40" w:before="40"/>
+            </w:pPr>
+            <w:r/>
             <w:r>
+              <w:rPr>
+                <w:b w:val="0"/>
+                <w:color w:val="374151"/>
+                <w:sz w:val="20"/>
+              </w:rPr>
               <w:t>EXPERIENCE_PRO.poste_actuel, ETUDIANT.id_promotion</w:t>
             </w:r>
           </w:p>
         </w:tc>
       </w:tr>
       <w:tr>
+        <w:trPr>
+          <w:cantSplit/>
+        </w:trPr>
         <w:tc>
           <w:tcPr>
-            <w:tcW w:type="dxa" w:w="4320"/>
+            <w:tcW w:type="dxa" w:w="2268"/>
+            <w:shd w:val="clear" w:color="auto" w:fill="FFFFFF"/>
+            <w:tcBorders>
+              <w:top w:val="single" w:sz="4" w:space="0" w:color="C4D2E2"/>
+              <w:left w:val="single" w:sz="4" w:space="0" w:color="C4D2E2"/>
+              <w:bottom w:val="single" w:sz="4" w:space="0" w:color="C4D2E2"/>
+              <w:right w:val="single" w:sz="4" w:space="0" w:color="C4D2E2"/>
+            </w:tcBorders>
           </w:tcPr>
           <w:p>
+            <w:pPr>
+              <w:spacing w:after="40" w:before="40"/>
+            </w:pPr>
+            <w:r/>
             <w:r>
               <w:rPr>
                 <w:b/>
+                <w:color w:val="374151"/>
+                <w:sz w:val="20"/>
               </w:rPr>
               <w:t>Exclusions / limites</w:t>
             </w:r>
@@ -774,24 +1546,56 @@
         </w:tc>
         <w:tc>
           <w:tcPr>
-            <w:tcW w:type="dxa" w:w="4320"/>
+            <w:tcW w:type="dxa" w:w="6803"/>
+            <w:shd w:val="clear" w:color="auto" w:fill="FFFFFF"/>
+            <w:tcBorders>
+              <w:top w:val="single" w:sz="4" w:space="0" w:color="C4D2E2"/>
+              <w:left w:val="single" w:sz="4" w:space="0" w:color="C4D2E2"/>
+              <w:bottom w:val="single" w:sz="4" w:space="0" w:color="C4D2E2"/>
+              <w:right w:val="single" w:sz="4" w:space="0" w:color="C4D2E2"/>
+            </w:tcBorders>
           </w:tcPr>
           <w:p>
+            <w:pPr>
+              <w:spacing w:after="40" w:before="40"/>
+            </w:pPr>
+            <w:r/>
             <w:r>
+              <w:rPr>
+                <w:b w:val="0"/>
+                <w:color w:val="374151"/>
+                <w:sz w:val="20"/>
+              </w:rPr>
               <w:t>Un seul comptage par etudiant (DISTINCT). availability_status non utilise.</w:t>
             </w:r>
           </w:p>
         </w:tc>
       </w:tr>
       <w:tr>
+        <w:trPr>
+          <w:cantSplit/>
+        </w:trPr>
         <w:tc>
           <w:tcPr>
-            <w:tcW w:type="dxa" w:w="4320"/>
+            <w:tcW w:type="dxa" w:w="2268"/>
+            <w:shd w:val="clear" w:color="auto" w:fill="F4F7FC"/>
+            <w:tcBorders>
+              <w:top w:val="single" w:sz="4" w:space="0" w:color="C4D2E2"/>
+              <w:left w:val="single" w:sz="4" w:space="0" w:color="C4D2E2"/>
+              <w:bottom w:val="single" w:sz="4" w:space="0" w:color="C4D2E2"/>
+              <w:right w:val="single" w:sz="4" w:space="0" w:color="C4D2E2"/>
+            </w:tcBorders>
           </w:tcPr>
           <w:p>
+            <w:pPr>
+              <w:spacing w:after="40" w:before="40"/>
+            </w:pPr>
+            <w:r/>
             <w:r>
               <w:rPr>
                 <w:b/>
+                <w:color w:val="374151"/>
+                <w:sz w:val="20"/>
               </w:rPr>
               <w:t>Exemple chiffre</w:t>
             </w:r>
@@ -799,10 +1603,26 @@
         </w:tc>
         <w:tc>
           <w:tcPr>
-            <w:tcW w:type="dxa" w:w="4320"/>
+            <w:tcW w:type="dxa" w:w="6803"/>
+            <w:shd w:val="clear" w:color="auto" w:fill="F4F7FC"/>
+            <w:tcBorders>
+              <w:top w:val="single" w:sz="4" w:space="0" w:color="C4D2E2"/>
+              <w:left w:val="single" w:sz="4" w:space="0" w:color="C4D2E2"/>
+              <w:bottom w:val="single" w:sz="4" w:space="0" w:color="C4D2E2"/>
+              <w:right w:val="single" w:sz="4" w:space="0" w:color="C4D2E2"/>
+            </w:tcBorders>
           </w:tcPr>
           <w:p>
+            <w:pPr>
+              <w:spacing w:after="40" w:before="40"/>
+            </w:pPr>
+            <w:r/>
             <w:r>
+              <w:rPr>
+                <w:b w:val="0"/>
+                <w:color w:val="374151"/>
+                <w:sz w:val="20"/>
+              </w:rPr>
               <w:t>Promo 2024 : 8 en poste / 10 -&gt; 80 %</w:t>
             </w:r>
           </w:p>
@@ -821,47 +1641,99 @@
     </w:p>
     <w:tbl>
       <w:tblPr>
-        <w:tblStyle w:val="LightGrid-Accent1"/>
+        <w:tblStyle w:val="TableGrid"/>
         <w:tblW w:type="auto" w:w="0"/>
+        <w:jc w:val="center"/>
+        <w:tblLayout w:type="fixed"/>
         <w:tblLook w:firstColumn="1" w:firstRow="1" w:lastColumn="0" w:lastRow="0" w:noHBand="0" w:noVBand="1" w:val="04A0"/>
       </w:tblPr>
       <w:tblGrid>
-        <w:gridCol w:w="4320"/>
-        <w:gridCol w:w="4320"/>
+        <w:gridCol w:w="4706"/>
+        <w:gridCol w:w="4706"/>
       </w:tblGrid>
       <w:tr>
+        <w:trPr>
+          <w:tblHeader/>
+          <w:cantSplit/>
+        </w:trPr>
         <w:tc>
           <w:tcPr>
-            <w:tcW w:type="dxa" w:w="4320"/>
+            <w:tcW w:type="dxa" w:w="2268"/>
             <w:shd w:val="clear" w:color="auto" w:fill="DBEAFE"/>
+            <w:tcBorders>
+              <w:top w:val="single" w:sz="4" w:space="0" w:color="C4D2E2"/>
+              <w:left w:val="single" w:sz="4" w:space="0" w:color="C4D2E2"/>
+              <w:bottom w:val="single" w:sz="4" w:space="0" w:color="C4D2E2"/>
+              <w:right w:val="single" w:sz="4" w:space="0" w:color="C4D2E2"/>
+            </w:tcBorders>
           </w:tcPr>
           <w:p>
+            <w:pPr>
+              <w:spacing w:after="40" w:before="40"/>
+            </w:pPr>
+            <w:r/>
             <w:r>
+              <w:rPr>
+                <w:b/>
+                <w:color w:val="1E293B"/>
+                <w:sz w:val="20"/>
+              </w:rPr>
               <w:t>Champ</w:t>
             </w:r>
           </w:p>
         </w:tc>
         <w:tc>
           <w:tcPr>
-            <w:tcW w:type="dxa" w:w="4320"/>
+            <w:tcW w:type="dxa" w:w="6803"/>
             <w:shd w:val="clear" w:color="auto" w:fill="DBEAFE"/>
+            <w:tcBorders>
+              <w:top w:val="single" w:sz="4" w:space="0" w:color="C4D2E2"/>
+              <w:left w:val="single" w:sz="4" w:space="0" w:color="C4D2E2"/>
+              <w:bottom w:val="single" w:sz="4" w:space="0" w:color="C4D2E2"/>
+              <w:right w:val="single" w:sz="4" w:space="0" w:color="C4D2E2"/>
+            </w:tcBorders>
           </w:tcPr>
           <w:p>
+            <w:pPr>
+              <w:spacing w:after="40" w:before="40"/>
+            </w:pPr>
+            <w:r/>
             <w:r>
+              <w:rPr>
+                <w:b/>
+                <w:color w:val="1E293B"/>
+                <w:sz w:val="20"/>
+              </w:rPr>
               <w:t>Valeur</w:t>
             </w:r>
           </w:p>
         </w:tc>
       </w:tr>
       <w:tr>
+        <w:trPr>
+          <w:cantSplit/>
+        </w:trPr>
         <w:tc>
           <w:tcPr>
-            <w:tcW w:type="dxa" w:w="4320"/>
+            <w:tcW w:type="dxa" w:w="2268"/>
+            <w:shd w:val="clear" w:color="auto" w:fill="FFFFFF"/>
+            <w:tcBorders>
+              <w:top w:val="single" w:sz="4" w:space="0" w:color="C4D2E2"/>
+              <w:left w:val="single" w:sz="4" w:space="0" w:color="C4D2E2"/>
+              <w:bottom w:val="single" w:sz="4" w:space="0" w:color="C4D2E2"/>
+              <w:right w:val="single" w:sz="4" w:space="0" w:color="C4D2E2"/>
+            </w:tcBorders>
           </w:tcPr>
           <w:p>
+            <w:pPr>
+              <w:spacing w:after="40" w:before="40"/>
+            </w:pPr>
+            <w:r/>
             <w:r>
               <w:rPr>
                 <w:b/>
+                <w:color w:val="374151"/>
+                <w:sz w:val="20"/>
               </w:rPr>
               <w:t>Formule</w:t>
             </w:r>
@@ -869,24 +1741,56 @@
         </w:tc>
         <w:tc>
           <w:tcPr>
-            <w:tcW w:type="dxa" w:w="4320"/>
+            <w:tcW w:type="dxa" w:w="6803"/>
+            <w:shd w:val="clear" w:color="auto" w:fill="FFFFFF"/>
+            <w:tcBorders>
+              <w:top w:val="single" w:sz="4" w:space="0" w:color="C4D2E2"/>
+              <w:left w:val="single" w:sz="4" w:space="0" w:color="C4D2E2"/>
+              <w:bottom w:val="single" w:sz="4" w:space="0" w:color="C4D2E2"/>
+              <w:right w:val="single" w:sz="4" w:space="0" w:color="C4D2E2"/>
+            </w:tcBorders>
           </w:tcPr>
           <w:p>
+            <w:pPr>
+              <w:spacing w:after="40" w:before="40"/>
+            </w:pPr>
+            <w:r/>
             <w:r>
+              <w:rPr>
+                <w:b w:val="0"/>
+                <w:color w:val="374151"/>
+                <w:sz w:val="20"/>
+              </w:rPr>
               <w:t>(reponses 'Oui' / reponses exploitables) x 100. Question retenue : tag = 'adequation_formation' + questionnaire actif le plus recent.</w:t>
             </w:r>
           </w:p>
         </w:tc>
       </w:tr>
       <w:tr>
+        <w:trPr>
+          <w:cantSplit/>
+        </w:trPr>
         <w:tc>
           <w:tcPr>
-            <w:tcW w:type="dxa" w:w="4320"/>
+            <w:tcW w:type="dxa" w:w="2268"/>
+            <w:shd w:val="clear" w:color="auto" w:fill="F4F7FC"/>
+            <w:tcBorders>
+              <w:top w:val="single" w:sz="4" w:space="0" w:color="C4D2E2"/>
+              <w:left w:val="single" w:sz="4" w:space="0" w:color="C4D2E2"/>
+              <w:bottom w:val="single" w:sz="4" w:space="0" w:color="C4D2E2"/>
+              <w:right w:val="single" w:sz="4" w:space="0" w:color="C4D2E2"/>
+            </w:tcBorders>
           </w:tcPr>
           <w:p>
+            <w:pPr>
+              <w:spacing w:after="40" w:before="40"/>
+            </w:pPr>
+            <w:r/>
             <w:r>
               <w:rPr>
                 <w:b/>
+                <w:color w:val="374151"/>
+                <w:sz w:val="20"/>
               </w:rPr>
               <w:t>Tables / colonnes</w:t>
             </w:r>
@@ -894,24 +1798,56 @@
         </w:tc>
         <w:tc>
           <w:tcPr>
-            <w:tcW w:type="dxa" w:w="4320"/>
+            <w:tcW w:type="dxa" w:w="6803"/>
+            <w:shd w:val="clear" w:color="auto" w:fill="F4F7FC"/>
+            <w:tcBorders>
+              <w:top w:val="single" w:sz="4" w:space="0" w:color="C4D2E2"/>
+              <w:left w:val="single" w:sz="4" w:space="0" w:color="C4D2E2"/>
+              <w:bottom w:val="single" w:sz="4" w:space="0" w:color="C4D2E2"/>
+              <w:right w:val="single" w:sz="4" w:space="0" w:color="C4D2E2"/>
+            </w:tcBorders>
           </w:tcPr>
           <w:p>
+            <w:pPr>
+              <w:spacing w:after="40" w:before="40"/>
+            </w:pPr>
+            <w:r/>
             <w:r>
+              <w:rPr>
+                <w:b w:val="0"/>
+                <w:color w:val="374151"/>
+                <w:sz w:val="20"/>
+              </w:rPr>
               <w:t>QUESTION.tag, QUESTIONNAIRE.actif, REPONSE_QUESTIONNAIRE.reponses (JSON)</w:t>
             </w:r>
           </w:p>
         </w:tc>
       </w:tr>
       <w:tr>
+        <w:trPr>
+          <w:cantSplit/>
+        </w:trPr>
         <w:tc>
           <w:tcPr>
-            <w:tcW w:type="dxa" w:w="4320"/>
+            <w:tcW w:type="dxa" w:w="2268"/>
+            <w:shd w:val="clear" w:color="auto" w:fill="FFFFFF"/>
+            <w:tcBorders>
+              <w:top w:val="single" w:sz="4" w:space="0" w:color="C4D2E2"/>
+              <w:left w:val="single" w:sz="4" w:space="0" w:color="C4D2E2"/>
+              <w:bottom w:val="single" w:sz="4" w:space="0" w:color="C4D2E2"/>
+              <w:right w:val="single" w:sz="4" w:space="0" w:color="C4D2E2"/>
+            </w:tcBorders>
           </w:tcPr>
           <w:p>
+            <w:pPr>
+              <w:spacing w:after="40" w:before="40"/>
+            </w:pPr>
+            <w:r/>
             <w:r>
               <w:rPr>
                 <w:b/>
+                <w:color w:val="374151"/>
+                <w:sz w:val="20"/>
               </w:rPr>
               <w:t>Exclusions / limites</w:t>
             </w:r>
@@ -919,24 +1855,56 @@
         </w:tc>
         <w:tc>
           <w:tcPr>
-            <w:tcW w:type="dxa" w:w="4320"/>
+            <w:tcW w:type="dxa" w:w="6803"/>
+            <w:shd w:val="clear" w:color="auto" w:fill="FFFFFF"/>
+            <w:tcBorders>
+              <w:top w:val="single" w:sz="4" w:space="0" w:color="C4D2E2"/>
+              <w:left w:val="single" w:sz="4" w:space="0" w:color="C4D2E2"/>
+              <w:bottom w:val="single" w:sz="4" w:space="0" w:color="C4D2E2"/>
+              <w:right w:val="single" w:sz="4" w:space="0" w:color="C4D2E2"/>
+            </w:tcBorders>
           </w:tcPr>
           <w:p>
+            <w:pPr>
+              <w:spacing w:after="40" w:before="40"/>
+            </w:pPr>
+            <w:r/>
             <w:r>
+              <w:rPr>
+                <w:b w:val="0"/>
+                <w:color w:val="374151"/>
+                <w:sz w:val="20"/>
+              </w:rPr>
               <w:t>Reponses 'non applicable' exclues du denominateur. Si aucune question taguee -&gt; etat vide.</w:t>
             </w:r>
           </w:p>
         </w:tc>
       </w:tr>
       <w:tr>
+        <w:trPr>
+          <w:cantSplit/>
+        </w:trPr>
         <w:tc>
           <w:tcPr>
-            <w:tcW w:type="dxa" w:w="4320"/>
+            <w:tcW w:type="dxa" w:w="2268"/>
+            <w:shd w:val="clear" w:color="auto" w:fill="F4F7FC"/>
+            <w:tcBorders>
+              <w:top w:val="single" w:sz="4" w:space="0" w:color="C4D2E2"/>
+              <w:left w:val="single" w:sz="4" w:space="0" w:color="C4D2E2"/>
+              <w:bottom w:val="single" w:sz="4" w:space="0" w:color="C4D2E2"/>
+              <w:right w:val="single" w:sz="4" w:space="0" w:color="C4D2E2"/>
+            </w:tcBorders>
           </w:tcPr>
           <w:p>
+            <w:pPr>
+              <w:spacing w:after="40" w:before="40"/>
+            </w:pPr>
+            <w:r/>
             <w:r>
               <w:rPr>
                 <w:b/>
+                <w:color w:val="374151"/>
+                <w:sz w:val="20"/>
               </w:rPr>
               <w:t>Exemple chiffre</w:t>
             </w:r>
@@ -944,10 +1912,26 @@
         </w:tc>
         <w:tc>
           <w:tcPr>
-            <w:tcW w:type="dxa" w:w="4320"/>
+            <w:tcW w:type="dxa" w:w="6803"/>
+            <w:shd w:val="clear" w:color="auto" w:fill="F4F7FC"/>
+            <w:tcBorders>
+              <w:top w:val="single" w:sz="4" w:space="0" w:color="C4D2E2"/>
+              <w:left w:val="single" w:sz="4" w:space="0" w:color="C4D2E2"/>
+              <w:bottom w:val="single" w:sz="4" w:space="0" w:color="C4D2E2"/>
+              <w:right w:val="single" w:sz="4" w:space="0" w:color="C4D2E2"/>
+            </w:tcBorders>
           </w:tcPr>
           <w:p>
+            <w:pPr>
+              <w:spacing w:after="40" w:before="40"/>
+            </w:pPr>
+            <w:r/>
             <w:r>
+              <w:rPr>
+                <w:b w:val="0"/>
+                <w:color w:val="374151"/>
+                <w:sz w:val="20"/>
+              </w:rPr>
               <w:t>5 reponses dont 1 'Non applicable' (Oui,Oui,Oui,Non) -&gt; 3/4 exploitables = 75 %</w:t>
             </w:r>
           </w:p>
@@ -966,47 +1950,99 @@
     </w:p>
     <w:tbl>
       <w:tblPr>
-        <w:tblStyle w:val="LightGrid-Accent1"/>
+        <w:tblStyle w:val="TableGrid"/>
         <w:tblW w:type="auto" w:w="0"/>
+        <w:jc w:val="center"/>
+        <w:tblLayout w:type="fixed"/>
         <w:tblLook w:firstColumn="1" w:firstRow="1" w:lastColumn="0" w:lastRow="0" w:noHBand="0" w:noVBand="1" w:val="04A0"/>
       </w:tblPr>
       <w:tblGrid>
-        <w:gridCol w:w="4320"/>
-        <w:gridCol w:w="4320"/>
+        <w:gridCol w:w="4706"/>
+        <w:gridCol w:w="4706"/>
       </w:tblGrid>
       <w:tr>
+        <w:trPr>
+          <w:tblHeader/>
+          <w:cantSplit/>
+        </w:trPr>
         <w:tc>
           <w:tcPr>
-            <w:tcW w:type="dxa" w:w="4320"/>
+            <w:tcW w:type="dxa" w:w="2268"/>
             <w:shd w:val="clear" w:color="auto" w:fill="DBEAFE"/>
+            <w:tcBorders>
+              <w:top w:val="single" w:sz="4" w:space="0" w:color="C4D2E2"/>
+              <w:left w:val="single" w:sz="4" w:space="0" w:color="C4D2E2"/>
+              <w:bottom w:val="single" w:sz="4" w:space="0" w:color="C4D2E2"/>
+              <w:right w:val="single" w:sz="4" w:space="0" w:color="C4D2E2"/>
+            </w:tcBorders>
           </w:tcPr>
           <w:p>
+            <w:pPr>
+              <w:spacing w:after="40" w:before="40"/>
+            </w:pPr>
+            <w:r/>
             <w:r>
+              <w:rPr>
+                <w:b/>
+                <w:color w:val="1E293B"/>
+                <w:sz w:val="20"/>
+              </w:rPr>
               <w:t>Champ</w:t>
             </w:r>
           </w:p>
         </w:tc>
         <w:tc>
           <w:tcPr>
-            <w:tcW w:type="dxa" w:w="4320"/>
+            <w:tcW w:type="dxa" w:w="6803"/>
             <w:shd w:val="clear" w:color="auto" w:fill="DBEAFE"/>
+            <w:tcBorders>
+              <w:top w:val="single" w:sz="4" w:space="0" w:color="C4D2E2"/>
+              <w:left w:val="single" w:sz="4" w:space="0" w:color="C4D2E2"/>
+              <w:bottom w:val="single" w:sz="4" w:space="0" w:color="C4D2E2"/>
+              <w:right w:val="single" w:sz="4" w:space="0" w:color="C4D2E2"/>
+            </w:tcBorders>
           </w:tcPr>
           <w:p>
+            <w:pPr>
+              <w:spacing w:after="40" w:before="40"/>
+            </w:pPr>
+            <w:r/>
             <w:r>
+              <w:rPr>
+                <w:b/>
+                <w:color w:val="1E293B"/>
+                <w:sz w:val="20"/>
+              </w:rPr>
               <w:t>Valeur</w:t>
             </w:r>
           </w:p>
         </w:tc>
       </w:tr>
       <w:tr>
+        <w:trPr>
+          <w:cantSplit/>
+        </w:trPr>
         <w:tc>
           <w:tcPr>
-            <w:tcW w:type="dxa" w:w="4320"/>
+            <w:tcW w:type="dxa" w:w="2268"/>
+            <w:shd w:val="clear" w:color="auto" w:fill="FFFFFF"/>
+            <w:tcBorders>
+              <w:top w:val="single" w:sz="4" w:space="0" w:color="C4D2E2"/>
+              <w:left w:val="single" w:sz="4" w:space="0" w:color="C4D2E2"/>
+              <w:bottom w:val="single" w:sz="4" w:space="0" w:color="C4D2E2"/>
+              <w:right w:val="single" w:sz="4" w:space="0" w:color="C4D2E2"/>
+            </w:tcBorders>
           </w:tcPr>
           <w:p>
+            <w:pPr>
+              <w:spacing w:after="40" w:before="40"/>
+            </w:pPr>
+            <w:r/>
             <w:r>
               <w:rPr>
                 <w:b/>
+                <w:color w:val="374151"/>
+                <w:sz w:val="20"/>
               </w:rPr>
               <w:t>Formule</w:t>
             </w:r>
@@ -1014,24 +2050,56 @@
         </w:tc>
         <w:tc>
           <w:tcPr>
-            <w:tcW w:type="dxa" w:w="4320"/>
+            <w:tcW w:type="dxa" w:w="6803"/>
+            <w:shd w:val="clear" w:color="auto" w:fill="FFFFFF"/>
+            <w:tcBorders>
+              <w:top w:val="single" w:sz="4" w:space="0" w:color="C4D2E2"/>
+              <w:left w:val="single" w:sz="4" w:space="0" w:color="C4D2E2"/>
+              <w:bottom w:val="single" w:sz="4" w:space="0" w:color="C4D2E2"/>
+              <w:right w:val="single" w:sz="4" w:space="0" w:color="C4D2E2"/>
+            </w:tcBorders>
           </w:tcPr>
           <w:p>
+            <w:pPr>
+              <w:spacing w:after="40" w:before="40"/>
+            </w:pPr>
+            <w:r/>
             <w:r>
+              <w:rPr>
+                <w:b w:val="0"/>
+                <w:color w:val="374151"/>
+                <w:sz w:val="20"/>
+              </w:rPr>
               <w:t>Par secteur : COUNT(DISTINCT id_etudiant) ayant poste_actuel = TRUE. % = count / total alumni actifs x 100.</w:t>
             </w:r>
           </w:p>
         </w:tc>
       </w:tr>
       <w:tr>
+        <w:trPr>
+          <w:cantSplit/>
+        </w:trPr>
         <w:tc>
           <w:tcPr>
-            <w:tcW w:type="dxa" w:w="4320"/>
+            <w:tcW w:type="dxa" w:w="2268"/>
+            <w:shd w:val="clear" w:color="auto" w:fill="F4F7FC"/>
+            <w:tcBorders>
+              <w:top w:val="single" w:sz="4" w:space="0" w:color="C4D2E2"/>
+              <w:left w:val="single" w:sz="4" w:space="0" w:color="C4D2E2"/>
+              <w:bottom w:val="single" w:sz="4" w:space="0" w:color="C4D2E2"/>
+              <w:right w:val="single" w:sz="4" w:space="0" w:color="C4D2E2"/>
+            </w:tcBorders>
           </w:tcPr>
           <w:p>
+            <w:pPr>
+              <w:spacing w:after="40" w:before="40"/>
+            </w:pPr>
+            <w:r/>
             <w:r>
               <w:rPr>
                 <w:b/>
+                <w:color w:val="374151"/>
+                <w:sz w:val="20"/>
               </w:rPr>
               <w:t>Tables / colonnes</w:t>
             </w:r>
@@ -1039,24 +2107,56 @@
         </w:tc>
         <w:tc>
           <w:tcPr>
-            <w:tcW w:type="dxa" w:w="4320"/>
+            <w:tcW w:type="dxa" w:w="6803"/>
+            <w:shd w:val="clear" w:color="auto" w:fill="F4F7FC"/>
+            <w:tcBorders>
+              <w:top w:val="single" w:sz="4" w:space="0" w:color="C4D2E2"/>
+              <w:left w:val="single" w:sz="4" w:space="0" w:color="C4D2E2"/>
+              <w:bottom w:val="single" w:sz="4" w:space="0" w:color="C4D2E2"/>
+              <w:right w:val="single" w:sz="4" w:space="0" w:color="C4D2E2"/>
+            </w:tcBorders>
           </w:tcPr>
           <w:p>
+            <w:pPr>
+              <w:spacing w:after="40" w:before="40"/>
+            </w:pPr>
+            <w:r/>
             <w:r>
+              <w:rPr>
+                <w:b w:val="0"/>
+                <w:color w:val="374151"/>
+                <w:sz w:val="20"/>
+              </w:rPr>
               <w:t>ENTREPRISE.secteur_activite, EXPERIENCE_PRO.poste_actuel</w:t>
             </w:r>
           </w:p>
         </w:tc>
       </w:tr>
       <w:tr>
+        <w:trPr>
+          <w:cantSplit/>
+        </w:trPr>
         <w:tc>
           <w:tcPr>
-            <w:tcW w:type="dxa" w:w="4320"/>
+            <w:tcW w:type="dxa" w:w="2268"/>
+            <w:shd w:val="clear" w:color="auto" w:fill="FFFFFF"/>
+            <w:tcBorders>
+              <w:top w:val="single" w:sz="4" w:space="0" w:color="C4D2E2"/>
+              <w:left w:val="single" w:sz="4" w:space="0" w:color="C4D2E2"/>
+              <w:bottom w:val="single" w:sz="4" w:space="0" w:color="C4D2E2"/>
+              <w:right w:val="single" w:sz="4" w:space="0" w:color="C4D2E2"/>
+            </w:tcBorders>
           </w:tcPr>
           <w:p>
+            <w:pPr>
+              <w:spacing w:after="40" w:before="40"/>
+            </w:pPr>
+            <w:r/>
             <w:r>
               <w:rPr>
                 <w:b/>
+                <w:color w:val="374151"/>
+                <w:sz w:val="20"/>
               </w:rPr>
               <w:t>Exclusions / limites</w:t>
             </w:r>
@@ -1064,24 +2164,56 @@
         </w:tc>
         <w:tc>
           <w:tcPr>
-            <w:tcW w:type="dxa" w:w="4320"/>
+            <w:tcW w:type="dxa" w:w="6803"/>
+            <w:shd w:val="clear" w:color="auto" w:fill="FFFFFF"/>
+            <w:tcBorders>
+              <w:top w:val="single" w:sz="4" w:space="0" w:color="C4D2E2"/>
+              <w:left w:val="single" w:sz="4" w:space="0" w:color="C4D2E2"/>
+              <w:bottom w:val="single" w:sz="4" w:space="0" w:color="C4D2E2"/>
+              <w:right w:val="single" w:sz="4" w:space="0" w:color="C4D2E2"/>
+            </w:tcBorders>
           </w:tcPr>
           <w:p>
+            <w:pPr>
+              <w:spacing w:after="40" w:before="40"/>
+            </w:pPr>
+            <w:r/>
             <w:r>
+              <w:rPr>
+                <w:b w:val="0"/>
+                <w:color w:val="374151"/>
+                <w:sz w:val="20"/>
+              </w:rPr>
               <w:t>Secteur vide exclu. Un alumni multi-postes peut apparaitre dans plusieurs secteurs.</w:t>
             </w:r>
           </w:p>
         </w:tc>
       </w:tr>
       <w:tr>
+        <w:trPr>
+          <w:cantSplit/>
+        </w:trPr>
         <w:tc>
           <w:tcPr>
-            <w:tcW w:type="dxa" w:w="4320"/>
+            <w:tcW w:type="dxa" w:w="2268"/>
+            <w:shd w:val="clear" w:color="auto" w:fill="F4F7FC"/>
+            <w:tcBorders>
+              <w:top w:val="single" w:sz="4" w:space="0" w:color="C4D2E2"/>
+              <w:left w:val="single" w:sz="4" w:space="0" w:color="C4D2E2"/>
+              <w:bottom w:val="single" w:sz="4" w:space="0" w:color="C4D2E2"/>
+              <w:right w:val="single" w:sz="4" w:space="0" w:color="C4D2E2"/>
+            </w:tcBorders>
           </w:tcPr>
           <w:p>
+            <w:pPr>
+              <w:spacing w:after="40" w:before="40"/>
+            </w:pPr>
+            <w:r/>
             <w:r>
               <w:rPr>
                 <w:b/>
+                <w:color w:val="374151"/>
+                <w:sz w:val="20"/>
               </w:rPr>
               <w:t>Exemple chiffre</w:t>
             </w:r>
@@ -1089,10 +2221,26 @@
         </w:tc>
         <w:tc>
           <w:tcPr>
-            <w:tcW w:type="dxa" w:w="4320"/>
+            <w:tcW w:type="dxa" w:w="6803"/>
+            <w:shd w:val="clear" w:color="auto" w:fill="F4F7FC"/>
+            <w:tcBorders>
+              <w:top w:val="single" w:sz="4" w:space="0" w:color="C4D2E2"/>
+              <w:left w:val="single" w:sz="4" w:space="0" w:color="C4D2E2"/>
+              <w:bottom w:val="single" w:sz="4" w:space="0" w:color="C4D2E2"/>
+              <w:right w:val="single" w:sz="4" w:space="0" w:color="C4D2E2"/>
+            </w:tcBorders>
           </w:tcPr>
           <w:p>
+            <w:pPr>
+              <w:spacing w:after="40" w:before="40"/>
+            </w:pPr>
+            <w:r/>
             <w:r>
+              <w:rPr>
+                <w:b w:val="0"/>
+                <w:color w:val="374151"/>
+                <w:sz w:val="20"/>
+              </w:rPr>
               <w:t>Info 3 (50%), Finance 2 (33%), Sante 1 (17%) -&gt; donut</w:t>
             </w:r>
           </w:p>
@@ -1111,47 +2259,99 @@
     </w:p>
     <w:tbl>
       <w:tblPr>
-        <w:tblStyle w:val="LightGrid-Accent1"/>
+        <w:tblStyle w:val="TableGrid"/>
         <w:tblW w:type="auto" w:w="0"/>
+        <w:jc w:val="center"/>
+        <w:tblLayout w:type="fixed"/>
         <w:tblLook w:firstColumn="1" w:firstRow="1" w:lastColumn="0" w:lastRow="0" w:noHBand="0" w:noVBand="1" w:val="04A0"/>
       </w:tblPr>
       <w:tblGrid>
-        <w:gridCol w:w="4320"/>
-        <w:gridCol w:w="4320"/>
+        <w:gridCol w:w="4706"/>
+        <w:gridCol w:w="4706"/>
       </w:tblGrid>
       <w:tr>
+        <w:trPr>
+          <w:tblHeader/>
+          <w:cantSplit/>
+        </w:trPr>
         <w:tc>
           <w:tcPr>
-            <w:tcW w:type="dxa" w:w="4320"/>
+            <w:tcW w:type="dxa" w:w="2268"/>
             <w:shd w:val="clear" w:color="auto" w:fill="DBEAFE"/>
+            <w:tcBorders>
+              <w:top w:val="single" w:sz="4" w:space="0" w:color="C4D2E2"/>
+              <w:left w:val="single" w:sz="4" w:space="0" w:color="C4D2E2"/>
+              <w:bottom w:val="single" w:sz="4" w:space="0" w:color="C4D2E2"/>
+              <w:right w:val="single" w:sz="4" w:space="0" w:color="C4D2E2"/>
+            </w:tcBorders>
           </w:tcPr>
           <w:p>
+            <w:pPr>
+              <w:spacing w:after="40" w:before="40"/>
+            </w:pPr>
+            <w:r/>
             <w:r>
+              <w:rPr>
+                <w:b/>
+                <w:color w:val="1E293B"/>
+                <w:sz w:val="20"/>
+              </w:rPr>
               <w:t>Champ</w:t>
             </w:r>
           </w:p>
         </w:tc>
         <w:tc>
           <w:tcPr>
-            <w:tcW w:type="dxa" w:w="4320"/>
+            <w:tcW w:type="dxa" w:w="6803"/>
             <w:shd w:val="clear" w:color="auto" w:fill="DBEAFE"/>
+            <w:tcBorders>
+              <w:top w:val="single" w:sz="4" w:space="0" w:color="C4D2E2"/>
+              <w:left w:val="single" w:sz="4" w:space="0" w:color="C4D2E2"/>
+              <w:bottom w:val="single" w:sz="4" w:space="0" w:color="C4D2E2"/>
+              <w:right w:val="single" w:sz="4" w:space="0" w:color="C4D2E2"/>
+            </w:tcBorders>
           </w:tcPr>
           <w:p>
+            <w:pPr>
+              <w:spacing w:after="40" w:before="40"/>
+            </w:pPr>
+            <w:r/>
             <w:r>
+              <w:rPr>
+                <w:b/>
+                <w:color w:val="1E293B"/>
+                <w:sz w:val="20"/>
+              </w:rPr>
               <w:t>Valeur</w:t>
             </w:r>
           </w:p>
         </w:tc>
       </w:tr>
       <w:tr>
+        <w:trPr>
+          <w:cantSplit/>
+        </w:trPr>
         <w:tc>
           <w:tcPr>
-            <w:tcW w:type="dxa" w:w="4320"/>
+            <w:tcW w:type="dxa" w:w="2268"/>
+            <w:shd w:val="clear" w:color="auto" w:fill="FFFFFF"/>
+            <w:tcBorders>
+              <w:top w:val="single" w:sz="4" w:space="0" w:color="C4D2E2"/>
+              <w:left w:val="single" w:sz="4" w:space="0" w:color="C4D2E2"/>
+              <w:bottom w:val="single" w:sz="4" w:space="0" w:color="C4D2E2"/>
+              <w:right w:val="single" w:sz="4" w:space="0" w:color="C4D2E2"/>
+            </w:tcBorders>
           </w:tcPr>
           <w:p>
+            <w:pPr>
+              <w:spacing w:after="40" w:before="40"/>
+            </w:pPr>
+            <w:r/>
             <w:r>
               <w:rPr>
                 <w:b/>
+                <w:color w:val="374151"/>
+                <w:sz w:val="20"/>
               </w:rPr>
               <w:t>Formule</w:t>
             </w:r>
@@ -1159,24 +2359,56 @@
         </w:tc>
         <w:tc>
           <w:tcPr>
-            <w:tcW w:type="dxa" w:w="4320"/>
+            <w:tcW w:type="dxa" w:w="6803"/>
+            <w:shd w:val="clear" w:color="auto" w:fill="FFFFFF"/>
+            <w:tcBorders>
+              <w:top w:val="single" w:sz="4" w:space="0" w:color="C4D2E2"/>
+              <w:left w:val="single" w:sz="4" w:space="0" w:color="C4D2E2"/>
+              <w:bottom w:val="single" w:sz="4" w:space="0" w:color="C4D2E2"/>
+              <w:right w:val="single" w:sz="4" w:space="0" w:color="C4D2E2"/>
+            </w:tcBorders>
           </w:tcPr>
           <w:p>
+            <w:pPr>
+              <w:spacing w:after="40" w:before="40"/>
+            </w:pPr>
+            <w:r/>
             <w:r>
+              <w:rPr>
+                <w:b w:val="0"/>
+                <w:color w:val="374151"/>
+                <w:sz w:val="20"/>
+              </w:rPr>
               <w:t>Par promotion : effectif, % en poste, couverture experience, salaire moyen. Promotions sans alumni exclues (HAVING COUNT &gt; 0).</w:t>
             </w:r>
           </w:p>
         </w:tc>
       </w:tr>
       <w:tr>
+        <w:trPr>
+          <w:cantSplit/>
+        </w:trPr>
         <w:tc>
           <w:tcPr>
-            <w:tcW w:type="dxa" w:w="4320"/>
+            <w:tcW w:type="dxa" w:w="2268"/>
+            <w:shd w:val="clear" w:color="auto" w:fill="F4F7FC"/>
+            <w:tcBorders>
+              <w:top w:val="single" w:sz="4" w:space="0" w:color="C4D2E2"/>
+              <w:left w:val="single" w:sz="4" w:space="0" w:color="C4D2E2"/>
+              <w:bottom w:val="single" w:sz="4" w:space="0" w:color="C4D2E2"/>
+              <w:right w:val="single" w:sz="4" w:space="0" w:color="C4D2E2"/>
+            </w:tcBorders>
           </w:tcPr>
           <w:p>
+            <w:pPr>
+              <w:spacing w:after="40" w:before="40"/>
+            </w:pPr>
+            <w:r/>
             <w:r>
               <w:rPr>
                 <w:b/>
+                <w:color w:val="374151"/>
+                <w:sz w:val="20"/>
               </w:rPr>
               <w:t>Tables / colonnes</w:t>
             </w:r>
@@ -1184,24 +2416,56 @@
         </w:tc>
         <w:tc>
           <w:tcPr>
-            <w:tcW w:type="dxa" w:w="4320"/>
+            <w:tcW w:type="dxa" w:w="6803"/>
+            <w:shd w:val="clear" w:color="auto" w:fill="F4F7FC"/>
+            <w:tcBorders>
+              <w:top w:val="single" w:sz="4" w:space="0" w:color="C4D2E2"/>
+              <w:left w:val="single" w:sz="4" w:space="0" w:color="C4D2E2"/>
+              <w:bottom w:val="single" w:sz="4" w:space="0" w:color="C4D2E2"/>
+              <w:right w:val="single" w:sz="4" w:space="0" w:color="C4D2E2"/>
+            </w:tcBorders>
           </w:tcPr>
           <w:p>
+            <w:pPr>
+              <w:spacing w:after="40" w:before="40"/>
+            </w:pPr>
+            <w:r/>
             <w:r>
+              <w:rPr>
+                <w:b w:val="0"/>
+                <w:color w:val="374151"/>
+                <w:sz w:val="20"/>
+              </w:rPr>
               <w:t>PROMOTION, ETUDIANT.id_promotion, EXPERIENCE_PRO.poste_actuel/salaire</w:t>
             </w:r>
           </w:p>
         </w:tc>
       </w:tr>
       <w:tr>
+        <w:trPr>
+          <w:cantSplit/>
+        </w:trPr>
         <w:tc>
           <w:tcPr>
-            <w:tcW w:type="dxa" w:w="4320"/>
+            <w:tcW w:type="dxa" w:w="2268"/>
+            <w:shd w:val="clear" w:color="auto" w:fill="FFFFFF"/>
+            <w:tcBorders>
+              <w:top w:val="single" w:sz="4" w:space="0" w:color="C4D2E2"/>
+              <w:left w:val="single" w:sz="4" w:space="0" w:color="C4D2E2"/>
+              <w:bottom w:val="single" w:sz="4" w:space="0" w:color="C4D2E2"/>
+              <w:right w:val="single" w:sz="4" w:space="0" w:color="C4D2E2"/>
+            </w:tcBorders>
           </w:tcPr>
           <w:p>
+            <w:pPr>
+              <w:spacing w:after="40" w:before="40"/>
+            </w:pPr>
+            <w:r/>
             <w:r>
               <w:rPr>
                 <w:b/>
+                <w:color w:val="374151"/>
+                <w:sz w:val="20"/>
               </w:rPr>
               <w:t>Exclusions / limites</w:t>
             </w:r>
@@ -1209,24 +2473,56 @@
         </w:tc>
         <w:tc>
           <w:tcPr>
-            <w:tcW w:type="dxa" w:w="4320"/>
+            <w:tcW w:type="dxa" w:w="6803"/>
+            <w:shd w:val="clear" w:color="auto" w:fill="FFFFFF"/>
+            <w:tcBorders>
+              <w:top w:val="single" w:sz="4" w:space="0" w:color="C4D2E2"/>
+              <w:left w:val="single" w:sz="4" w:space="0" w:color="C4D2E2"/>
+              <w:bottom w:val="single" w:sz="4" w:space="0" w:color="C4D2E2"/>
+              <w:right w:val="single" w:sz="4" w:space="0" w:color="C4D2E2"/>
+            </w:tcBorders>
           </w:tcPr>
           <w:p>
+            <w:pPr>
+              <w:spacing w:after="40" w:before="40"/>
+            </w:pPr>
+            <w:r/>
             <w:r>
+              <w:rPr>
+                <w:b w:val="0"/>
+                <w:color w:val="374151"/>
+                <w:sz w:val="20"/>
+              </w:rPr>
               <w:t>Salaire moyen sur postes actuels uniquement.</w:t>
             </w:r>
           </w:p>
         </w:tc>
       </w:tr>
       <w:tr>
+        <w:trPr>
+          <w:cantSplit/>
+        </w:trPr>
         <w:tc>
           <w:tcPr>
-            <w:tcW w:type="dxa" w:w="4320"/>
+            <w:tcW w:type="dxa" w:w="2268"/>
+            <w:shd w:val="clear" w:color="auto" w:fill="F4F7FC"/>
+            <w:tcBorders>
+              <w:top w:val="single" w:sz="4" w:space="0" w:color="C4D2E2"/>
+              <w:left w:val="single" w:sz="4" w:space="0" w:color="C4D2E2"/>
+              <w:bottom w:val="single" w:sz="4" w:space="0" w:color="C4D2E2"/>
+              <w:right w:val="single" w:sz="4" w:space="0" w:color="C4D2E2"/>
+            </w:tcBorders>
           </w:tcPr>
           <w:p>
+            <w:pPr>
+              <w:spacing w:after="40" w:before="40"/>
+            </w:pPr>
+            <w:r/>
             <w:r>
               <w:rPr>
                 <w:b/>
+                <w:color w:val="374151"/>
+                <w:sz w:val="20"/>
               </w:rPr>
               <w:t>Exemple chiffre</w:t>
             </w:r>
@@ -1234,10 +2530,26 @@
         </w:tc>
         <w:tc>
           <w:tcPr>
-            <w:tcW w:type="dxa" w:w="4320"/>
+            <w:tcW w:type="dxa" w:w="6803"/>
+            <w:shd w:val="clear" w:color="auto" w:fill="F4F7FC"/>
+            <w:tcBorders>
+              <w:top w:val="single" w:sz="4" w:space="0" w:color="C4D2E2"/>
+              <w:left w:val="single" w:sz="4" w:space="0" w:color="C4D2E2"/>
+              <w:bottom w:val="single" w:sz="4" w:space="0" w:color="C4D2E2"/>
+              <w:right w:val="single" w:sz="4" w:space="0" w:color="C4D2E2"/>
+            </w:tcBorders>
           </w:tcPr>
           <w:p>
+            <w:pPr>
+              <w:spacing w:after="40" w:before="40"/>
+            </w:pPr>
+            <w:r/>
             <w:r>
+              <w:rPr>
+                <w:b w:val="0"/>
+                <w:color w:val="374151"/>
+                <w:sz w:val="20"/>
+              </w:rPr>
               <w:t>2024 : 10, 80% ; 2025 : 12, 75% ; 2026 : 15, 73%</w:t>
             </w:r>
           </w:p>
@@ -1256,47 +2568,99 @@
     </w:p>
     <w:tbl>
       <w:tblPr>
-        <w:tblStyle w:val="LightGrid-Accent1"/>
+        <w:tblStyle w:val="TableGrid"/>
         <w:tblW w:type="auto" w:w="0"/>
+        <w:jc w:val="center"/>
+        <w:tblLayout w:type="fixed"/>
         <w:tblLook w:firstColumn="1" w:firstRow="1" w:lastColumn="0" w:lastRow="0" w:noHBand="0" w:noVBand="1" w:val="04A0"/>
       </w:tblPr>
       <w:tblGrid>
-        <w:gridCol w:w="4320"/>
-        <w:gridCol w:w="4320"/>
+        <w:gridCol w:w="4706"/>
+        <w:gridCol w:w="4706"/>
       </w:tblGrid>
       <w:tr>
+        <w:trPr>
+          <w:tblHeader/>
+          <w:cantSplit/>
+        </w:trPr>
         <w:tc>
           <w:tcPr>
-            <w:tcW w:type="dxa" w:w="4320"/>
+            <w:tcW w:type="dxa" w:w="2268"/>
             <w:shd w:val="clear" w:color="auto" w:fill="DBEAFE"/>
+            <w:tcBorders>
+              <w:top w:val="single" w:sz="4" w:space="0" w:color="C4D2E2"/>
+              <w:left w:val="single" w:sz="4" w:space="0" w:color="C4D2E2"/>
+              <w:bottom w:val="single" w:sz="4" w:space="0" w:color="C4D2E2"/>
+              <w:right w:val="single" w:sz="4" w:space="0" w:color="C4D2E2"/>
+            </w:tcBorders>
           </w:tcPr>
           <w:p>
+            <w:pPr>
+              <w:spacing w:after="40" w:before="40"/>
+            </w:pPr>
+            <w:r/>
             <w:r>
+              <w:rPr>
+                <w:b/>
+                <w:color w:val="1E293B"/>
+                <w:sz w:val="20"/>
+              </w:rPr>
               <w:t>Champ</w:t>
             </w:r>
           </w:p>
         </w:tc>
         <w:tc>
           <w:tcPr>
-            <w:tcW w:type="dxa" w:w="4320"/>
+            <w:tcW w:type="dxa" w:w="6803"/>
             <w:shd w:val="clear" w:color="auto" w:fill="DBEAFE"/>
+            <w:tcBorders>
+              <w:top w:val="single" w:sz="4" w:space="0" w:color="C4D2E2"/>
+              <w:left w:val="single" w:sz="4" w:space="0" w:color="C4D2E2"/>
+              <w:bottom w:val="single" w:sz="4" w:space="0" w:color="C4D2E2"/>
+              <w:right w:val="single" w:sz="4" w:space="0" w:color="C4D2E2"/>
+            </w:tcBorders>
           </w:tcPr>
           <w:p>
+            <w:pPr>
+              <w:spacing w:after="40" w:before="40"/>
+            </w:pPr>
+            <w:r/>
             <w:r>
+              <w:rPr>
+                <w:b/>
+                <w:color w:val="1E293B"/>
+                <w:sz w:val="20"/>
+              </w:rPr>
               <w:t>Valeur</w:t>
             </w:r>
           </w:p>
         </w:tc>
       </w:tr>
       <w:tr>
+        <w:trPr>
+          <w:cantSplit/>
+        </w:trPr>
         <w:tc>
           <w:tcPr>
-            <w:tcW w:type="dxa" w:w="4320"/>
+            <w:tcW w:type="dxa" w:w="2268"/>
+            <w:shd w:val="clear" w:color="auto" w:fill="FFFFFF"/>
+            <w:tcBorders>
+              <w:top w:val="single" w:sz="4" w:space="0" w:color="C4D2E2"/>
+              <w:left w:val="single" w:sz="4" w:space="0" w:color="C4D2E2"/>
+              <w:bottom w:val="single" w:sz="4" w:space="0" w:color="C4D2E2"/>
+              <w:right w:val="single" w:sz="4" w:space="0" w:color="C4D2E2"/>
+            </w:tcBorders>
           </w:tcPr>
           <w:p>
+            <w:pPr>
+              <w:spacing w:after="40" w:before="40"/>
+            </w:pPr>
+            <w:r/>
             <w:r>
               <w:rPr>
                 <w:b/>
+                <w:color w:val="374151"/>
+                <w:sz w:val="20"/>
               </w:rPr>
               <w:t>Formule</w:t>
             </w:r>
@@ -1304,24 +2668,56 @@
         </w:tc>
         <w:tc>
           <w:tcPr>
-            <w:tcW w:type="dxa" w:w="4320"/>
+            <w:tcW w:type="dxa" w:w="6803"/>
+            <w:shd w:val="clear" w:color="auto" w:fill="FFFFFF"/>
+            <w:tcBorders>
+              <w:top w:val="single" w:sz="4" w:space="0" w:color="C4D2E2"/>
+              <w:left w:val="single" w:sz="4" w:space="0" w:color="C4D2E2"/>
+              <w:bottom w:val="single" w:sz="4" w:space="0" w:color="C4D2E2"/>
+              <w:right w:val="single" w:sz="4" w:space="0" w:color="C4D2E2"/>
+            </w:tcBorders>
           </w:tcPr>
           <w:p>
+            <w:pPr>
+              <w:spacing w:after="40" w:before="40"/>
+            </w:pPr>
+            <w:r/>
             <w:r>
+              <w:rPr>
+                <w:b w:val="0"/>
+                <w:color w:val="374151"/>
+                <w:sz w:val="20"/>
+              </w:rPr>
               <w:t>AVG(CASE WHEN salary_annuel &gt; 0 THEN salary_annuel ELSE salaire END). Filtres : poste_actuel = TRUE, salaire &gt; 0, non anonymises. Fourchette jauge : si &gt;= 5 salaires -&gt; [min x 0.9, max x 1.1] ; sinon [val x 0.7, val x 1.3] + mention 'indicatif'.</w:t>
             </w:r>
           </w:p>
         </w:tc>
       </w:tr>
       <w:tr>
+        <w:trPr>
+          <w:cantSplit/>
+        </w:trPr>
         <w:tc>
           <w:tcPr>
-            <w:tcW w:type="dxa" w:w="4320"/>
+            <w:tcW w:type="dxa" w:w="2268"/>
+            <w:shd w:val="clear" w:color="auto" w:fill="F4F7FC"/>
+            <w:tcBorders>
+              <w:top w:val="single" w:sz="4" w:space="0" w:color="C4D2E2"/>
+              <w:left w:val="single" w:sz="4" w:space="0" w:color="C4D2E2"/>
+              <w:bottom w:val="single" w:sz="4" w:space="0" w:color="C4D2E2"/>
+              <w:right w:val="single" w:sz="4" w:space="0" w:color="C4D2E2"/>
+            </w:tcBorders>
           </w:tcPr>
           <w:p>
+            <w:pPr>
+              <w:spacing w:after="40" w:before="40"/>
+            </w:pPr>
+            <w:r/>
             <w:r>
               <w:rPr>
                 <w:b/>
+                <w:color w:val="374151"/>
+                <w:sz w:val="20"/>
               </w:rPr>
               <w:t>Tables / colonnes</w:t>
             </w:r>
@@ -1329,24 +2725,56 @@
         </w:tc>
         <w:tc>
           <w:tcPr>
-            <w:tcW w:type="dxa" w:w="4320"/>
+            <w:tcW w:type="dxa" w:w="6803"/>
+            <w:shd w:val="clear" w:color="auto" w:fill="F4F7FC"/>
+            <w:tcBorders>
+              <w:top w:val="single" w:sz="4" w:space="0" w:color="C4D2E2"/>
+              <w:left w:val="single" w:sz="4" w:space="0" w:color="C4D2E2"/>
+              <w:bottom w:val="single" w:sz="4" w:space="0" w:color="C4D2E2"/>
+              <w:right w:val="single" w:sz="4" w:space="0" w:color="C4D2E2"/>
+            </w:tcBorders>
           </w:tcPr>
           <w:p>
+            <w:pPr>
+              <w:spacing w:after="40" w:before="40"/>
+            </w:pPr>
+            <w:r/>
             <w:r>
+              <w:rPr>
+                <w:b w:val="0"/>
+                <w:color w:val="374151"/>
+                <w:sz w:val="20"/>
+              </w:rPr>
               <w:t>EXPERIENCE_PRO.salary_annuel, salaire, poste_actuel</w:t>
             </w:r>
           </w:p>
         </w:tc>
       </w:tr>
       <w:tr>
+        <w:trPr>
+          <w:cantSplit/>
+        </w:trPr>
         <w:tc>
           <w:tcPr>
-            <w:tcW w:type="dxa" w:w="4320"/>
+            <w:tcW w:type="dxa" w:w="2268"/>
+            <w:shd w:val="clear" w:color="auto" w:fill="FFFFFF"/>
+            <w:tcBorders>
+              <w:top w:val="single" w:sz="4" w:space="0" w:color="C4D2E2"/>
+              <w:left w:val="single" w:sz="4" w:space="0" w:color="C4D2E2"/>
+              <w:bottom w:val="single" w:sz="4" w:space="0" w:color="C4D2E2"/>
+              <w:right w:val="single" w:sz="4" w:space="0" w:color="C4D2E2"/>
+            </w:tcBorders>
           </w:tcPr>
           <w:p>
+            <w:pPr>
+              <w:spacing w:after="40" w:before="40"/>
+            </w:pPr>
+            <w:r/>
             <w:r>
               <w:rPr>
                 <w:b/>
+                <w:color w:val="374151"/>
+                <w:sz w:val="20"/>
               </w:rPr>
               <w:t>Exclusions / limites</w:t>
             </w:r>
@@ -1354,24 +2782,56 @@
         </w:tc>
         <w:tc>
           <w:tcPr>
-            <w:tcW w:type="dxa" w:w="4320"/>
+            <w:tcW w:type="dxa" w:w="6803"/>
+            <w:shd w:val="clear" w:color="auto" w:fill="FFFFFF"/>
+            <w:tcBorders>
+              <w:top w:val="single" w:sz="4" w:space="0" w:color="C4D2E2"/>
+              <w:left w:val="single" w:sz="4" w:space="0" w:color="C4D2E2"/>
+              <w:bottom w:val="single" w:sz="4" w:space="0" w:color="C4D2E2"/>
+              <w:right w:val="single" w:sz="4" w:space="0" w:color="C4D2E2"/>
+            </w:tcBorders>
           </w:tcPr>
           <w:p>
+            <w:pPr>
+              <w:spacing w:after="40" w:before="40"/>
+            </w:pPr>
+            <w:r/>
             <w:r>
+              <w:rPr>
+                <w:b w:val="0"/>
+                <w:color w:val="374151"/>
+                <w:sz w:val="20"/>
+              </w:rPr>
               <w:t>Salaires nuls exclus. Echantillon &lt; 5 : fourchette elargie, mention affichee.</w:t>
             </w:r>
           </w:p>
         </w:tc>
       </w:tr>
       <w:tr>
+        <w:trPr>
+          <w:cantSplit/>
+        </w:trPr>
         <w:tc>
           <w:tcPr>
-            <w:tcW w:type="dxa" w:w="4320"/>
+            <w:tcW w:type="dxa" w:w="2268"/>
+            <w:shd w:val="clear" w:color="auto" w:fill="F4F7FC"/>
+            <w:tcBorders>
+              <w:top w:val="single" w:sz="4" w:space="0" w:color="C4D2E2"/>
+              <w:left w:val="single" w:sz="4" w:space="0" w:color="C4D2E2"/>
+              <w:bottom w:val="single" w:sz="4" w:space="0" w:color="C4D2E2"/>
+              <w:right w:val="single" w:sz="4" w:space="0" w:color="C4D2E2"/>
+            </w:tcBorders>
           </w:tcPr>
           <w:p>
+            <w:pPr>
+              <w:spacing w:after="40" w:before="40"/>
+            </w:pPr>
+            <w:r/>
             <w:r>
               <w:rPr>
                 <w:b/>
+                <w:color w:val="374151"/>
+                <w:sz w:val="20"/>
               </w:rPr>
               <w:t>Exemple chiffre</w:t>
             </w:r>
@@ -1379,10 +2839,26 @@
         </w:tc>
         <w:tc>
           <w:tcPr>
-            <w:tcW w:type="dxa" w:w="4320"/>
+            <w:tcW w:type="dxa" w:w="6803"/>
+            <w:shd w:val="clear" w:color="auto" w:fill="F4F7FC"/>
+            <w:tcBorders>
+              <w:top w:val="single" w:sz="4" w:space="0" w:color="C4D2E2"/>
+              <w:left w:val="single" w:sz="4" w:space="0" w:color="C4D2E2"/>
+              <w:bottom w:val="single" w:sz="4" w:space="0" w:color="C4D2E2"/>
+              <w:right w:val="single" w:sz="4" w:space="0" w:color="C4D2E2"/>
+            </w:tcBorders>
           </w:tcPr>
           <w:p>
+            <w:pPr>
+              <w:spacing w:after="40" w:before="40"/>
+            </w:pPr>
+            <w:r/>
             <w:r>
+              <w:rPr>
+                <w:b w:val="0"/>
+                <w:color w:val="374151"/>
+                <w:sz w:val="20"/>
+              </w:rPr>
               <w:t>38000, 42000, 50000 -&gt; moyenne 43333 ; n=3 &lt; 5 -&gt; fourchette [30333, 56333] indicatif</w:t>
             </w:r>
           </w:p>
@@ -1401,47 +2877,99 @@
     </w:p>
     <w:tbl>
       <w:tblPr>
-        <w:tblStyle w:val="LightGrid-Accent1"/>
+        <w:tblStyle w:val="TableGrid"/>
         <w:tblW w:type="auto" w:w="0"/>
+        <w:jc w:val="center"/>
+        <w:tblLayout w:type="fixed"/>
         <w:tblLook w:firstColumn="1" w:firstRow="1" w:lastColumn="0" w:lastRow="0" w:noHBand="0" w:noVBand="1" w:val="04A0"/>
       </w:tblPr>
       <w:tblGrid>
-        <w:gridCol w:w="4320"/>
-        <w:gridCol w:w="4320"/>
+        <w:gridCol w:w="4706"/>
+        <w:gridCol w:w="4706"/>
       </w:tblGrid>
       <w:tr>
+        <w:trPr>
+          <w:tblHeader/>
+          <w:cantSplit/>
+        </w:trPr>
         <w:tc>
           <w:tcPr>
-            <w:tcW w:type="dxa" w:w="4320"/>
+            <w:tcW w:type="dxa" w:w="2268"/>
             <w:shd w:val="clear" w:color="auto" w:fill="DBEAFE"/>
+            <w:tcBorders>
+              <w:top w:val="single" w:sz="4" w:space="0" w:color="C4D2E2"/>
+              <w:left w:val="single" w:sz="4" w:space="0" w:color="C4D2E2"/>
+              <w:bottom w:val="single" w:sz="4" w:space="0" w:color="C4D2E2"/>
+              <w:right w:val="single" w:sz="4" w:space="0" w:color="C4D2E2"/>
+            </w:tcBorders>
           </w:tcPr>
           <w:p>
+            <w:pPr>
+              <w:spacing w:after="40" w:before="40"/>
+            </w:pPr>
+            <w:r/>
             <w:r>
+              <w:rPr>
+                <w:b/>
+                <w:color w:val="1E293B"/>
+                <w:sz w:val="20"/>
+              </w:rPr>
               <w:t>Champ</w:t>
             </w:r>
           </w:p>
         </w:tc>
         <w:tc>
           <w:tcPr>
-            <w:tcW w:type="dxa" w:w="4320"/>
+            <w:tcW w:type="dxa" w:w="6803"/>
             <w:shd w:val="clear" w:color="auto" w:fill="DBEAFE"/>
+            <w:tcBorders>
+              <w:top w:val="single" w:sz="4" w:space="0" w:color="C4D2E2"/>
+              <w:left w:val="single" w:sz="4" w:space="0" w:color="C4D2E2"/>
+              <w:bottom w:val="single" w:sz="4" w:space="0" w:color="C4D2E2"/>
+              <w:right w:val="single" w:sz="4" w:space="0" w:color="C4D2E2"/>
+            </w:tcBorders>
           </w:tcPr>
           <w:p>
+            <w:pPr>
+              <w:spacing w:after="40" w:before="40"/>
+            </w:pPr>
+            <w:r/>
             <w:r>
+              <w:rPr>
+                <w:b/>
+                <w:color w:val="1E293B"/>
+                <w:sz w:val="20"/>
+              </w:rPr>
               <w:t>Valeur</w:t>
             </w:r>
           </w:p>
         </w:tc>
       </w:tr>
       <w:tr>
+        <w:trPr>
+          <w:cantSplit/>
+        </w:trPr>
         <w:tc>
           <w:tcPr>
-            <w:tcW w:type="dxa" w:w="4320"/>
+            <w:tcW w:type="dxa" w:w="2268"/>
+            <w:shd w:val="clear" w:color="auto" w:fill="FFFFFF"/>
+            <w:tcBorders>
+              <w:top w:val="single" w:sz="4" w:space="0" w:color="C4D2E2"/>
+              <w:left w:val="single" w:sz="4" w:space="0" w:color="C4D2E2"/>
+              <w:bottom w:val="single" w:sz="4" w:space="0" w:color="C4D2E2"/>
+              <w:right w:val="single" w:sz="4" w:space="0" w:color="C4D2E2"/>
+            </w:tcBorders>
           </w:tcPr>
           <w:p>
+            <w:pPr>
+              <w:spacing w:after="40" w:before="40"/>
+            </w:pPr>
+            <w:r/>
             <w:r>
               <w:rPr>
                 <w:b/>
+                <w:color w:val="374151"/>
+                <w:sz w:val="20"/>
               </w:rPr>
               <w:t>Formule</w:t>
             </w:r>
@@ -1449,24 +2977,56 @@
         </w:tc>
         <w:tc>
           <w:tcPr>
-            <w:tcW w:type="dxa" w:w="4320"/>
+            <w:tcW w:type="dxa" w:w="6803"/>
+            <w:shd w:val="clear" w:color="auto" w:fill="FFFFFF"/>
+            <w:tcBorders>
+              <w:top w:val="single" w:sz="4" w:space="0" w:color="C4D2E2"/>
+              <w:left w:val="single" w:sz="4" w:space="0" w:color="C4D2E2"/>
+              <w:bottom w:val="single" w:sz="4" w:space="0" w:color="C4D2E2"/>
+              <w:right w:val="single" w:sz="4" w:space="0" w:color="C4D2E2"/>
+            </w:tcBorders>
           </w:tcPr>
           <w:p>
+            <w:pPr>
+              <w:spacing w:after="40" w:before="40"/>
+            </w:pPr>
+            <w:r/>
             <w:r>
+              <w:rPr>
+                <w:b w:val="0"/>
+                <w:color w:val="374151"/>
+                <w:sz w:val="20"/>
+              </w:rPr>
               <w:t>Par type : COUNT(*) des experiences en cours (poste_actuel = TRUE ou dates en cours)</w:t>
             </w:r>
           </w:p>
         </w:tc>
       </w:tr>
       <w:tr>
+        <w:trPr>
+          <w:cantSplit/>
+        </w:trPr>
         <w:tc>
           <w:tcPr>
-            <w:tcW w:type="dxa" w:w="4320"/>
+            <w:tcW w:type="dxa" w:w="2268"/>
+            <w:shd w:val="clear" w:color="auto" w:fill="F4F7FC"/>
+            <w:tcBorders>
+              <w:top w:val="single" w:sz="4" w:space="0" w:color="C4D2E2"/>
+              <w:left w:val="single" w:sz="4" w:space="0" w:color="C4D2E2"/>
+              <w:bottom w:val="single" w:sz="4" w:space="0" w:color="C4D2E2"/>
+              <w:right w:val="single" w:sz="4" w:space="0" w:color="C4D2E2"/>
+            </w:tcBorders>
           </w:tcPr>
           <w:p>
+            <w:pPr>
+              <w:spacing w:after="40" w:before="40"/>
+            </w:pPr>
+            <w:r/>
             <w:r>
               <w:rPr>
                 <w:b/>
+                <w:color w:val="374151"/>
+                <w:sz w:val="20"/>
               </w:rPr>
               <w:t>Tables / colonnes</w:t>
             </w:r>
@@ -1474,24 +3034,56 @@
         </w:tc>
         <w:tc>
           <w:tcPr>
-            <w:tcW w:type="dxa" w:w="4320"/>
+            <w:tcW w:type="dxa" w:w="6803"/>
+            <w:shd w:val="clear" w:color="auto" w:fill="F4F7FC"/>
+            <w:tcBorders>
+              <w:top w:val="single" w:sz="4" w:space="0" w:color="C4D2E2"/>
+              <w:left w:val="single" w:sz="4" w:space="0" w:color="C4D2E2"/>
+              <w:bottom w:val="single" w:sz="4" w:space="0" w:color="C4D2E2"/>
+              <w:right w:val="single" w:sz="4" w:space="0" w:color="C4D2E2"/>
+            </w:tcBorders>
           </w:tcPr>
           <w:p>
+            <w:pPr>
+              <w:spacing w:after="40" w:before="40"/>
+            </w:pPr>
+            <w:r/>
             <w:r>
+              <w:rPr>
+                <w:b w:val="0"/>
+                <w:color w:val="374151"/>
+                <w:sz w:val="20"/>
+              </w:rPr>
               <w:t>EXPERIENCE_PRO.type_contrat, poste_actuel, date_debut/fin</w:t>
             </w:r>
           </w:p>
         </w:tc>
       </w:tr>
       <w:tr>
+        <w:trPr>
+          <w:cantSplit/>
+        </w:trPr>
         <w:tc>
           <w:tcPr>
-            <w:tcW w:type="dxa" w:w="4320"/>
+            <w:tcW w:type="dxa" w:w="2268"/>
+            <w:shd w:val="clear" w:color="auto" w:fill="FFFFFF"/>
+            <w:tcBorders>
+              <w:top w:val="single" w:sz="4" w:space="0" w:color="C4D2E2"/>
+              <w:left w:val="single" w:sz="4" w:space="0" w:color="C4D2E2"/>
+              <w:bottom w:val="single" w:sz="4" w:space="0" w:color="C4D2E2"/>
+              <w:right w:val="single" w:sz="4" w:space="0" w:color="C4D2E2"/>
+            </w:tcBorders>
           </w:tcPr>
           <w:p>
+            <w:pPr>
+              <w:spacing w:after="40" w:before="40"/>
+            </w:pPr>
+            <w:r/>
             <w:r>
               <w:rPr>
                 <w:b/>
+                <w:color w:val="374151"/>
+                <w:sz w:val="20"/>
               </w:rPr>
               <w:t>Exclusions / limites</w:t>
             </w:r>
@@ -1499,24 +3091,56 @@
         </w:tc>
         <w:tc>
           <w:tcPr>
-            <w:tcW w:type="dxa" w:w="4320"/>
+            <w:tcW w:type="dxa" w:w="6803"/>
+            <w:shd w:val="clear" w:color="auto" w:fill="FFFFFF"/>
+            <w:tcBorders>
+              <w:top w:val="single" w:sz="4" w:space="0" w:color="C4D2E2"/>
+              <w:left w:val="single" w:sz="4" w:space="0" w:color="C4D2E2"/>
+              <w:bottom w:val="single" w:sz="4" w:space="0" w:color="C4D2E2"/>
+              <w:right w:val="single" w:sz="4" w:space="0" w:color="C4D2E2"/>
+            </w:tcBorders>
           </w:tcPr>
           <w:p>
+            <w:pPr>
+              <w:spacing w:after="40" w:before="40"/>
+            </w:pPr>
+            <w:r/>
             <w:r>
+              <w:rPr>
+                <w:b w:val="0"/>
+                <w:color w:val="374151"/>
+                <w:sz w:val="20"/>
+              </w:rPr>
               <w:t>On compte des experiences (pas des alumni). Valeurs vides -&gt; 'Non renseigne'.</w:t>
             </w:r>
           </w:p>
         </w:tc>
       </w:tr>
       <w:tr>
+        <w:trPr>
+          <w:cantSplit/>
+        </w:trPr>
         <w:tc>
           <w:tcPr>
-            <w:tcW w:type="dxa" w:w="4320"/>
+            <w:tcW w:type="dxa" w:w="2268"/>
+            <w:shd w:val="clear" w:color="auto" w:fill="F4F7FC"/>
+            <w:tcBorders>
+              <w:top w:val="single" w:sz="4" w:space="0" w:color="C4D2E2"/>
+              <w:left w:val="single" w:sz="4" w:space="0" w:color="C4D2E2"/>
+              <w:bottom w:val="single" w:sz="4" w:space="0" w:color="C4D2E2"/>
+              <w:right w:val="single" w:sz="4" w:space="0" w:color="C4D2E2"/>
+            </w:tcBorders>
           </w:tcPr>
           <w:p>
+            <w:pPr>
+              <w:spacing w:after="40" w:before="40"/>
+            </w:pPr>
+            <w:r/>
             <w:r>
               <w:rPr>
                 <w:b/>
+                <w:color w:val="374151"/>
+                <w:sz w:val="20"/>
               </w:rPr>
               <w:t>Exemple chiffre</w:t>
             </w:r>
@@ -1524,10 +3148,26 @@
         </w:tc>
         <w:tc>
           <w:tcPr>
-            <w:tcW w:type="dxa" w:w="4320"/>
+            <w:tcW w:type="dxa" w:w="6803"/>
+            <w:shd w:val="clear" w:color="auto" w:fill="F4F7FC"/>
+            <w:tcBorders>
+              <w:top w:val="single" w:sz="4" w:space="0" w:color="C4D2E2"/>
+              <w:left w:val="single" w:sz="4" w:space="0" w:color="C4D2E2"/>
+              <w:bottom w:val="single" w:sz="4" w:space="0" w:color="C4D2E2"/>
+              <w:right w:val="single" w:sz="4" w:space="0" w:color="C4D2E2"/>
+            </w:tcBorders>
           </w:tcPr>
           <w:p>
+            <w:pPr>
+              <w:spacing w:after="40" w:before="40"/>
+            </w:pPr>
+            <w:r/>
             <w:r>
+              <w:rPr>
+                <w:b w:val="0"/>
+                <w:color w:val="374151"/>
+                <w:sz w:val="20"/>
+              </w:rPr>
               <w:t>CDI 6, CDD 3, Stage 1, vide -&gt; 'Non renseigne' 1</w:t>
             </w:r>
           </w:p>
@@ -1547,193 +3187,475 @@
     </w:p>
     <w:tbl>
       <w:tblPr>
-        <w:tblStyle w:val="LightGrid-Accent1"/>
+        <w:tblStyle w:val="TableGrid"/>
         <w:tblW w:type="auto" w:w="0"/>
+        <w:jc w:val="center"/>
+        <w:tblLayout w:type="fixed"/>
         <w:tblLook w:firstColumn="1" w:firstRow="1" w:lastColumn="0" w:lastRow="0" w:noHBand="0" w:noVBand="1" w:val="04A0"/>
       </w:tblPr>
       <w:tblGrid>
-        <w:gridCol w:w="4320"/>
-        <w:gridCol w:w="4320"/>
+        <w:gridCol w:w="4706"/>
+        <w:gridCol w:w="4706"/>
       </w:tblGrid>
       <w:tr>
+        <w:trPr>
+          <w:tblHeader/>
+          <w:cantSplit/>
+        </w:trPr>
         <w:tc>
           <w:tcPr>
-            <w:tcW w:type="dxa" w:w="4320"/>
+            <w:tcW w:type="dxa" w:w="2835"/>
             <w:shd w:val="clear" w:color="auto" w:fill="DBEAFE"/>
+            <w:tcBorders>
+              <w:top w:val="single" w:sz="4" w:space="0" w:color="C4D2E2"/>
+              <w:left w:val="single" w:sz="4" w:space="0" w:color="C4D2E2"/>
+              <w:bottom w:val="single" w:sz="4" w:space="0" w:color="C4D2E2"/>
+              <w:right w:val="single" w:sz="4" w:space="0" w:color="C4D2E2"/>
+            </w:tcBorders>
           </w:tcPr>
           <w:p>
+            <w:pPr>
+              <w:spacing w:after="40" w:before="40"/>
+            </w:pPr>
+            <w:r/>
             <w:r>
+              <w:rPr>
+                <w:b/>
+                <w:color w:val="1E293B"/>
+                <w:sz w:val="20"/>
+              </w:rPr>
               <w:t>Endpoint</w:t>
             </w:r>
           </w:p>
         </w:tc>
         <w:tc>
           <w:tcPr>
-            <w:tcW w:type="dxa" w:w="4320"/>
+            <w:tcW w:type="dxa" w:w="6236"/>
             <w:shd w:val="clear" w:color="auto" w:fill="DBEAFE"/>
+            <w:tcBorders>
+              <w:top w:val="single" w:sz="4" w:space="0" w:color="C4D2E2"/>
+              <w:left w:val="single" w:sz="4" w:space="0" w:color="C4D2E2"/>
+              <w:bottom w:val="single" w:sz="4" w:space="0" w:color="C4D2E2"/>
+              <w:right w:val="single" w:sz="4" w:space="0" w:color="C4D2E2"/>
+            </w:tcBorders>
           </w:tcPr>
           <w:p>
+            <w:pPr>
+              <w:spacing w:after="40" w:before="40"/>
+            </w:pPr>
+            <w:r/>
             <w:r>
+              <w:rPr>
+                <w:b/>
+                <w:color w:val="1E293B"/>
+                <w:sz w:val="20"/>
+              </w:rPr>
               <w:t>Description</w:t>
             </w:r>
           </w:p>
         </w:tc>
       </w:tr>
       <w:tr>
+        <w:trPr>
+          <w:cantSplit/>
+        </w:trPr>
         <w:tc>
           <w:tcPr>
-            <w:tcW w:type="dxa" w:w="4320"/>
+            <w:tcW w:type="dxa" w:w="2835"/>
+            <w:shd w:val="clear" w:color="auto" w:fill="FFFFFF"/>
+            <w:tcBorders>
+              <w:top w:val="single" w:sz="4" w:space="0" w:color="C4D2E2"/>
+              <w:left w:val="single" w:sz="4" w:space="0" w:color="C4D2E2"/>
+              <w:bottom w:val="single" w:sz="4" w:space="0" w:color="C4D2E2"/>
+              <w:right w:val="single" w:sz="4" w:space="0" w:color="C4D2E2"/>
+            </w:tcBorders>
           </w:tcPr>
           <w:p>
+            <w:pPr>
+              <w:spacing w:after="40" w:before="40"/>
+            </w:pPr>
+            <w:r/>
             <w:r>
+              <w:rPr>
+                <w:b w:val="0"/>
+                <w:color w:val="374151"/>
+                <w:sz w:val="20"/>
+              </w:rPr>
               <w:t>GET /admin/indicateurs</w:t>
             </w:r>
           </w:p>
         </w:tc>
         <w:tc>
           <w:tcPr>
-            <w:tcW w:type="dxa" w:w="4320"/>
+            <w:tcW w:type="dxa" w:w="6236"/>
+            <w:shd w:val="clear" w:color="auto" w:fill="FFFFFF"/>
+            <w:tcBorders>
+              <w:top w:val="single" w:sz="4" w:space="0" w:color="C4D2E2"/>
+              <w:left w:val="single" w:sz="4" w:space="0" w:color="C4D2E2"/>
+              <w:bottom w:val="single" w:sz="4" w:space="0" w:color="C4D2E2"/>
+              <w:right w:val="single" w:sz="4" w:space="0" w:color="C4D2E2"/>
+            </w:tcBorders>
           </w:tcPr>
           <w:p>
+            <w:pPr>
+              <w:spacing w:after="40" w:before="40"/>
+            </w:pPr>
+            <w:r/>
             <w:r>
+              <w:rPr>
+                <w:b w:val="0"/>
+                <w:color w:val="374151"/>
+                <w:sz w:val="20"/>
+              </w:rPr>
               <w:t>Indicateurs principaux (taux emploi 6 mois/global, taux_reponse, alumni_actifs, salaire_moyen/min/max, coherence, hypothese, source_de_verite)</w:t>
             </w:r>
           </w:p>
         </w:tc>
       </w:tr>
       <w:tr>
+        <w:trPr>
+          <w:cantSplit/>
+        </w:trPr>
         <w:tc>
           <w:tcPr>
-            <w:tcW w:type="dxa" w:w="4320"/>
+            <w:tcW w:type="dxa" w:w="2835"/>
+            <w:shd w:val="clear" w:color="auto" w:fill="F4F7FC"/>
+            <w:tcBorders>
+              <w:top w:val="single" w:sz="4" w:space="0" w:color="C4D2E2"/>
+              <w:left w:val="single" w:sz="4" w:space="0" w:color="C4D2E2"/>
+              <w:bottom w:val="single" w:sz="4" w:space="0" w:color="C4D2E2"/>
+              <w:right w:val="single" w:sz="4" w:space="0" w:color="C4D2E2"/>
+            </w:tcBorders>
           </w:tcPr>
           <w:p>
+            <w:pPr>
+              <w:spacing w:after="40" w:before="40"/>
+            </w:pPr>
+            <w:r/>
             <w:r>
+              <w:rPr>
+                <w:b w:val="0"/>
+                <w:color w:val="374151"/>
+                <w:sz w:val="20"/>
+              </w:rPr>
               <w:t>GET /admin/indicateurs/secteurs</w:t>
             </w:r>
           </w:p>
         </w:tc>
         <w:tc>
           <w:tcPr>
-            <w:tcW w:type="dxa" w:w="4320"/>
+            <w:tcW w:type="dxa" w:w="6236"/>
+            <w:shd w:val="clear" w:color="auto" w:fill="F4F7FC"/>
+            <w:tcBorders>
+              <w:top w:val="single" w:sz="4" w:space="0" w:color="C4D2E2"/>
+              <w:left w:val="single" w:sz="4" w:space="0" w:color="C4D2E2"/>
+              <w:bottom w:val="single" w:sz="4" w:space="0" w:color="C4D2E2"/>
+              <w:right w:val="single" w:sz="4" w:space="0" w:color="C4D2E2"/>
+            </w:tcBorders>
           </w:tcPr>
           <w:p>
+            <w:pPr>
+              <w:spacing w:after="40" w:before="40"/>
+            </w:pPr>
+            <w:r/>
             <w:r>
+              <w:rPr>
+                <w:b w:val="0"/>
+                <w:color w:val="374151"/>
+                <w:sz w:val="20"/>
+              </w:rPr>
               <w:t>Repartition par secteur {secteur, count} + total_alumni</w:t>
             </w:r>
           </w:p>
         </w:tc>
       </w:tr>
       <w:tr>
+        <w:trPr>
+          <w:cantSplit/>
+        </w:trPr>
         <w:tc>
           <w:tcPr>
-            <w:tcW w:type="dxa" w:w="4320"/>
+            <w:tcW w:type="dxa" w:w="2835"/>
+            <w:shd w:val="clear" w:color="auto" w:fill="FFFFFF"/>
+            <w:tcBorders>
+              <w:top w:val="single" w:sz="4" w:space="0" w:color="C4D2E2"/>
+              <w:left w:val="single" w:sz="4" w:space="0" w:color="C4D2E2"/>
+              <w:bottom w:val="single" w:sz="4" w:space="0" w:color="C4D2E2"/>
+              <w:right w:val="single" w:sz="4" w:space="0" w:color="C4D2E2"/>
+            </w:tcBorders>
           </w:tcPr>
           <w:p>
+            <w:pPr>
+              <w:spacing w:after="40" w:before="40"/>
+            </w:pPr>
+            <w:r/>
             <w:r>
+              <w:rPr>
+                <w:b w:val="0"/>
+                <w:color w:val="374151"/>
+                <w:sz w:val="20"/>
+              </w:rPr>
               <w:t>GET /admin/indicateurs/types-contrat</w:t>
             </w:r>
           </w:p>
         </w:tc>
         <w:tc>
           <w:tcPr>
-            <w:tcW w:type="dxa" w:w="4320"/>
+            <w:tcW w:type="dxa" w:w="6236"/>
+            <w:shd w:val="clear" w:color="auto" w:fill="FFFFFF"/>
+            <w:tcBorders>
+              <w:top w:val="single" w:sz="4" w:space="0" w:color="C4D2E2"/>
+              <w:left w:val="single" w:sz="4" w:space="0" w:color="C4D2E2"/>
+              <w:bottom w:val="single" w:sz="4" w:space="0" w:color="C4D2E2"/>
+              <w:right w:val="single" w:sz="4" w:space="0" w:color="C4D2E2"/>
+            </w:tcBorders>
           </w:tcPr>
           <w:p>
+            <w:pPr>
+              <w:spacing w:after="40" w:before="40"/>
+            </w:pPr>
+            <w:r/>
             <w:r>
+              <w:rPr>
+                <w:b w:val="0"/>
+                <w:color w:val="374151"/>
+                <w:sz w:val="20"/>
+              </w:rPr>
               <w:t>Repartition par type de contrat (vides -&gt; Non renseigne)</w:t>
             </w:r>
           </w:p>
         </w:tc>
       </w:tr>
       <w:tr>
+        <w:trPr>
+          <w:cantSplit/>
+        </w:trPr>
         <w:tc>
           <w:tcPr>
-            <w:tcW w:type="dxa" w:w="4320"/>
+            <w:tcW w:type="dxa" w:w="2835"/>
+            <w:shd w:val="clear" w:color="auto" w:fill="F4F7FC"/>
+            <w:tcBorders>
+              <w:top w:val="single" w:sz="4" w:space="0" w:color="C4D2E2"/>
+              <w:left w:val="single" w:sz="4" w:space="0" w:color="C4D2E2"/>
+              <w:bottom w:val="single" w:sz="4" w:space="0" w:color="C4D2E2"/>
+              <w:right w:val="single" w:sz="4" w:space="0" w:color="C4D2E2"/>
+            </w:tcBorders>
           </w:tcPr>
           <w:p>
+            <w:pPr>
+              <w:spacing w:after="40" w:before="40"/>
+            </w:pPr>
+            <w:r/>
             <w:r>
+              <w:rPr>
+                <w:b w:val="0"/>
+                <w:color w:val="374151"/>
+                <w:sz w:val="20"/>
+              </w:rPr>
               <w:t>GET /admin/indicateurs/kpi-tag?tag=X</w:t>
             </w:r>
           </w:p>
         </w:tc>
         <w:tc>
           <w:tcPr>
-            <w:tcW w:type="dxa" w:w="4320"/>
+            <w:tcW w:type="dxa" w:w="6236"/>
+            <w:shd w:val="clear" w:color="auto" w:fill="F4F7FC"/>
+            <w:tcBorders>
+              <w:top w:val="single" w:sz="4" w:space="0" w:color="C4D2E2"/>
+              <w:left w:val="single" w:sz="4" w:space="0" w:color="C4D2E2"/>
+              <w:bottom w:val="single" w:sz="4" w:space="0" w:color="C4D2E2"/>
+              <w:right w:val="single" w:sz="4" w:space="0" w:color="C4D2E2"/>
+            </w:tcBorders>
           </w:tcPr>
           <w:p>
+            <w:pPr>
+              <w:spacing w:after="40" w:before="40"/>
+            </w:pPr>
+            <w:r/>
             <w:r>
+              <w:rPr>
+                <w:b w:val="0"/>
+                <w:color w:val="374151"/>
+                <w:sz w:val="20"/>
+              </w:rPr>
               <w:t>Valeur d'un KPI specifique (valeur, unite, distribution, detail)</w:t>
             </w:r>
           </w:p>
         </w:tc>
       </w:tr>
       <w:tr>
+        <w:trPr>
+          <w:cantSplit/>
+        </w:trPr>
         <w:tc>
           <w:tcPr>
-            <w:tcW w:type="dxa" w:w="4320"/>
+            <w:tcW w:type="dxa" w:w="2835"/>
+            <w:shd w:val="clear" w:color="auto" w:fill="FFFFFF"/>
+            <w:tcBorders>
+              <w:top w:val="single" w:sz="4" w:space="0" w:color="C4D2E2"/>
+              <w:left w:val="single" w:sz="4" w:space="0" w:color="C4D2E2"/>
+              <w:bottom w:val="single" w:sz="4" w:space="0" w:color="C4D2E2"/>
+              <w:right w:val="single" w:sz="4" w:space="0" w:color="C4D2E2"/>
+            </w:tcBorders>
           </w:tcPr>
           <w:p>
+            <w:pPr>
+              <w:spacing w:after="40" w:before="40"/>
+            </w:pPr>
+            <w:r/>
             <w:r>
+              <w:rPr>
+                <w:b w:val="0"/>
+                <w:color w:val="374151"/>
+                <w:sz w:val="20"/>
+              </w:rPr>
               <w:t>GET /admin/indicateurs/kpi-tags</w:t>
             </w:r>
           </w:p>
         </w:tc>
         <w:tc>
           <w:tcPr>
-            <w:tcW w:type="dxa" w:w="4320"/>
+            <w:tcW w:type="dxa" w:w="6236"/>
+            <w:shd w:val="clear" w:color="auto" w:fill="FFFFFF"/>
+            <w:tcBorders>
+              <w:top w:val="single" w:sz="4" w:space="0" w:color="C4D2E2"/>
+              <w:left w:val="single" w:sz="4" w:space="0" w:color="C4D2E2"/>
+              <w:bottom w:val="single" w:sz="4" w:space="0" w:color="C4D2E2"/>
+              <w:right w:val="single" w:sz="4" w:space="0" w:color="C4D2E2"/>
+            </w:tcBorders>
           </w:tcPr>
           <w:p>
+            <w:pPr>
+              <w:spacing w:after="40" w:before="40"/>
+            </w:pPr>
+            <w:r/>
             <w:r>
+              <w:rPr>
+                <w:b w:val="0"/>
+                <w:color w:val="374151"/>
+                <w:sz w:val="20"/>
+              </w:rPr>
               <w:t>Tous les tags KPI des questionnaires actifs, calcules automatiquement</w:t>
             </w:r>
           </w:p>
         </w:tc>
       </w:tr>
       <w:tr>
+        <w:trPr>
+          <w:cantSplit/>
+        </w:trPr>
         <w:tc>
           <w:tcPr>
-            <w:tcW w:type="dxa" w:w="4320"/>
+            <w:tcW w:type="dxa" w:w="2835"/>
+            <w:shd w:val="clear" w:color="auto" w:fill="F4F7FC"/>
+            <w:tcBorders>
+              <w:top w:val="single" w:sz="4" w:space="0" w:color="C4D2E2"/>
+              <w:left w:val="single" w:sz="4" w:space="0" w:color="C4D2E2"/>
+              <w:bottom w:val="single" w:sz="4" w:space="0" w:color="C4D2E2"/>
+              <w:right w:val="single" w:sz="4" w:space="0" w:color="C4D2E2"/>
+            </w:tcBorders>
           </w:tcPr>
           <w:p>
+            <w:pPr>
+              <w:spacing w:after="40" w:before="40"/>
+            </w:pPr>
+            <w:r/>
             <w:r>
+              <w:rPr>
+                <w:b w:val="0"/>
+                <w:color w:val="374151"/>
+                <w:sz w:val="20"/>
+              </w:rPr>
               <w:t>GET /admin/indicateurs/kpi-tags-actifs</w:t>
             </w:r>
           </w:p>
         </w:tc>
         <w:tc>
           <w:tcPr>
-            <w:tcW w:type="dxa" w:w="4320"/>
+            <w:tcW w:type="dxa" w:w="6236"/>
+            <w:shd w:val="clear" w:color="auto" w:fill="F4F7FC"/>
+            <w:tcBorders>
+              <w:top w:val="single" w:sz="4" w:space="0" w:color="C4D2E2"/>
+              <w:left w:val="single" w:sz="4" w:space="0" w:color="C4D2E2"/>
+              <w:bottom w:val="single" w:sz="4" w:space="0" w:color="C4D2E2"/>
+              <w:right w:val="single" w:sz="4" w:space="0" w:color="C4D2E2"/>
+            </w:tcBorders>
           </w:tcPr>
           <w:p>
+            <w:pPr>
+              <w:spacing w:after="40" w:before="40"/>
+            </w:pPr>
+            <w:r/>
             <w:r>
+              <w:rPr>
+                <w:b w:val="0"/>
+                <w:color w:val="374151"/>
+                <w:sz w:val="20"/>
+              </w:rPr>
               <w:t>Tags DISTINCT des questionnaires actifs</w:t>
             </w:r>
           </w:p>
         </w:tc>
       </w:tr>
       <w:tr>
+        <w:trPr>
+          <w:cantSplit/>
+        </w:trPr>
         <w:tc>
           <w:tcPr>
-            <w:tcW w:type="dxa" w:w="4320"/>
+            <w:tcW w:type="dxa" w:w="2835"/>
+            <w:shd w:val="clear" w:color="auto" w:fill="FFFFFF"/>
+            <w:tcBorders>
+              <w:top w:val="single" w:sz="4" w:space="0" w:color="C4D2E2"/>
+              <w:left w:val="single" w:sz="4" w:space="0" w:color="C4D2E2"/>
+              <w:bottom w:val="single" w:sz="4" w:space="0" w:color="C4D2E2"/>
+              <w:right w:val="single" w:sz="4" w:space="0" w:color="C4D2E2"/>
+            </w:tcBorders>
           </w:tcPr>
           <w:p>
+            <w:pPr>
+              <w:spacing w:after="40" w:before="40"/>
+            </w:pPr>
+            <w:r/>
             <w:r>
+              <w:rPr>
+                <w:b w:val="0"/>
+                <w:color w:val="374151"/>
+                <w:sz w:val="20"/>
+              </w:rPr>
               <w:t>GET /admin/indicateurs/partenaires</w:t>
             </w:r>
           </w:p>
         </w:tc>
         <w:tc>
           <w:tcPr>
-            <w:tcW w:type="dxa" w:w="4320"/>
+            <w:tcW w:type="dxa" w:w="6236"/>
+            <w:shd w:val="clear" w:color="auto" w:fill="FFFFFF"/>
+            <w:tcBorders>
+              <w:top w:val="single" w:sz="4" w:space="0" w:color="C4D2E2"/>
+              <w:left w:val="single" w:sz="4" w:space="0" w:color="C4D2E2"/>
+              <w:bottom w:val="single" w:sz="4" w:space="0" w:color="C4D2E2"/>
+              <w:right w:val="single" w:sz="4" w:space="0" w:color="C4D2E2"/>
+            </w:tcBorders>
           </w:tcPr>
           <w:p>
+            <w:pPr>
+              <w:spacing w:after="40" w:before="40"/>
+            </w:pPr>
+            <w:r/>
             <w:r>
+              <w:rPr>
+                <w:b w:val="0"/>
+                <w:color w:val="374151"/>
+                <w:sz w:val="20"/>
+              </w:rPr>
               <w:t>Indicateurs anonymises restreints aux alumni 'partage_donnees' actif</w:t>
             </w:r>
           </w:p>
         </w:tc>
       </w:tr>
     </w:tbl>
+    <w:p/>
     <w:p>
       <w:r>
         <w:rPr>
@@ -1790,8 +3712,8 @@
       </w:r>
     </w:p>
     <w:sectPr>
-      <w:pgSz w:w="12240" w:h="15840"/>
-      <w:pgMar w:top="1440" w:right="1800" w:bottom="1440" w:left="1800" w:header="720" w:footer="720" w:gutter="0"/>
+      <w:pgSz w:w="11906" w:h="16838"/>
+      <w:pgMar w:top="1361" w:right="1247" w:bottom="1474" w:left="1247" w:header="720" w:footer="720" w:gutter="0"/>
       <w:cols w:space="720"/>
       <w:docGrid w:linePitch="360"/>
     </w:sectPr>

</xml_diff>